<commit_message>
Updated the assembly section
</commit_message>
<xml_diff>
--- a/Documents/GTernal_Users_Guide.docx
+++ b/Documents/GTernal_Users_Guide.docx
@@ -1,6 +1,6 @@
 
 <file path=word/document.xml><?xml version="1.0" encoding="utf-8"?>
-<w:document xmlns:wpc="http://schemas.microsoft.com/office/word/2010/wordprocessingCanvas" xmlns:cx="http://schemas.microsoft.com/office/drawing/2014/chartex" xmlns:cx1="http://schemas.microsoft.com/office/drawing/2015/9/8/chartex" xmlns:cx2="http://schemas.microsoft.com/office/drawing/2015/10/21/chartex" xmlns:cx3="http://schemas.microsoft.com/office/drawing/2016/5/9/chartex" xmlns:cx4="http://schemas.microsoft.com/office/drawing/2016/5/10/chartex" xmlns:cx5="http://schemas.microsoft.com/office/drawing/2016/5/11/chartex" xmlns:cx6="http://schemas.microsoft.com/office/drawing/2016/5/12/chartex" xmlns:cx7="http://schemas.microsoft.com/office/drawing/2016/5/13/chartex" xmlns:cx8="http://schemas.microsoft.com/office/drawing/2016/5/14/chartex" xmlns:mc="http://schemas.openxmlformats.org/markup-compatibility/2006" xmlns:aink="http://schemas.microsoft.com/office/drawing/2016/ink" xmlns:am3d="http://schemas.microsoft.com/office/drawing/2017/model3d" xmlns:o="urn:schemas-microsoft-com:office:office" xmlns:oel="http://schemas.microsoft.com/office/2019/extlst" xmlns:r="http://schemas.openxmlformats.org/officeDocument/2006/relationships" xmlns:m="http://schemas.openxmlformats.org/officeDocument/2006/math" xmlns:v="urn:schemas-microsoft-com:vml" xmlns:wp14="http://schemas.microsoft.com/office/word/2010/wordprocessingDrawing" xmlns:wp="http://schemas.openxmlformats.org/drawingml/2006/wordprocessingDrawing" xmlns:w10="urn:schemas-microsoft-com:office:word" xmlns:w="http://schemas.openxmlformats.org/wordprocessingml/2006/main" xmlns:w14="http://schemas.microsoft.com/office/word/2010/wordml" xmlns:w15="http://schemas.microsoft.com/office/word/2012/wordml" xmlns:w16cex="http://schemas.microsoft.com/office/word/2018/wordml/cex" xmlns:w16cid="http://schemas.microsoft.com/office/word/2016/wordml/cid" xmlns:w16="http://schemas.microsoft.com/office/word/2018/wordml" xmlns:w16sdtdh="http://schemas.microsoft.com/office/word/2020/wordml/sdtdatahash" xmlns:w16se="http://schemas.microsoft.com/office/word/2015/wordml/symex" xmlns:wpg="http://schemas.microsoft.com/office/word/2010/wordprocessingGroup" xmlns:wpi="http://schemas.microsoft.com/office/word/2010/wordprocessingInk" xmlns:wne="http://schemas.microsoft.com/office/word/2006/wordml" xmlns:wps="http://schemas.microsoft.com/office/word/2010/wordprocessingShape" mc:Ignorable="w14 w15 w16se w16cid w16 w16cex w16sdtdh wp14">
+<w:document xmlns:wpc="http://schemas.microsoft.com/office/word/2010/wordprocessingCanvas" xmlns:cx="http://schemas.microsoft.com/office/drawing/2014/chartex" xmlns:cx1="http://schemas.microsoft.com/office/drawing/2015/9/8/chartex" xmlns:cx2="http://schemas.microsoft.com/office/drawing/2015/10/21/chartex" xmlns:cx3="http://schemas.microsoft.com/office/drawing/2016/5/9/chartex" xmlns:cx4="http://schemas.microsoft.com/office/drawing/2016/5/10/chartex" xmlns:cx5="http://schemas.microsoft.com/office/drawing/2016/5/11/chartex" xmlns:cx6="http://schemas.microsoft.com/office/drawing/2016/5/12/chartex" xmlns:cx7="http://schemas.microsoft.com/office/drawing/2016/5/13/chartex" xmlns:cx8="http://schemas.microsoft.com/office/drawing/2016/5/14/chartex" xmlns:mc="http://schemas.openxmlformats.org/markup-compatibility/2006" xmlns:aink="http://schemas.microsoft.com/office/drawing/2016/ink" xmlns:am3d="http://schemas.microsoft.com/office/drawing/2017/model3d" xmlns:o="urn:schemas-microsoft-com:office:office" xmlns:oel="http://schemas.microsoft.com/office/2019/extlst" xmlns:r="http://schemas.openxmlformats.org/officeDocument/2006/relationships" xmlns:m="http://schemas.openxmlformats.org/officeDocument/2006/math" xmlns:v="urn:schemas-microsoft-com:vml" xmlns:wp14="http://schemas.microsoft.com/office/word/2010/wordprocessingDrawing" xmlns:wp="http://schemas.openxmlformats.org/drawingml/2006/wordprocessingDrawing" xmlns:w10="urn:schemas-microsoft-com:office:word" xmlns:w="http://schemas.openxmlformats.org/wordprocessingml/2006/main" xmlns:w14="http://schemas.microsoft.com/office/word/2010/wordml" xmlns:w15="http://schemas.microsoft.com/office/word/2012/wordml" xmlns:w16cex="http://schemas.microsoft.com/office/word/2018/wordml/cex" xmlns:w16cid="http://schemas.microsoft.com/office/word/2016/wordml/cid" xmlns:w16="http://schemas.microsoft.com/office/word/2018/wordml" xmlns:w16du="http://schemas.microsoft.com/office/word/2023/wordml/word16du" xmlns:w16sdtdh="http://schemas.microsoft.com/office/word/2020/wordml/sdtdatahash" xmlns:w16se="http://schemas.microsoft.com/office/word/2015/wordml/symex" xmlns:wpg="http://schemas.microsoft.com/office/word/2010/wordprocessingGroup" xmlns:wpi="http://schemas.microsoft.com/office/word/2010/wordprocessingInk" xmlns:wne="http://schemas.microsoft.com/office/word/2006/wordml" xmlns:wps="http://schemas.microsoft.com/office/word/2010/wordprocessingShape" mc:Ignorable="w14 w15 w16se w16cid w16 w16cex w16sdtdh w16du wp14">
   <w:body>
     <w:p>
       <w:pPr>
@@ -172,21 +172,41 @@
         <w:rPr>
           <w:rFonts w:ascii="Cambria" w:hAnsi="Cambria" w:cs="Arial"/>
         </w:rPr>
+        <w:t>,</w:t>
+      </w:r>
+    </w:p>
+    <w:p>
+      <w:pPr>
+        <w:jc w:val="center"/>
+        <w:rPr>
+          <w:rFonts w:ascii="Cambria" w:hAnsi="Cambria" w:cs="Arial"/>
+        </w:rPr>
+      </w:pPr>
+      <w:proofErr w:type="spellStart"/>
+      <w:r>
+        <w:rPr>
+          <w:rFonts w:ascii="Cambria" w:hAnsi="Cambria" w:cs="Arial"/>
+        </w:rPr>
+        <w:t>Soobum</w:t>
+      </w:r>
+      <w:proofErr w:type="spellEnd"/>
+      <w:r>
+        <w:rPr>
+          <w:rFonts w:ascii="Cambria" w:hAnsi="Cambria" w:cs="Arial"/>
+        </w:rPr>
+        <w:t xml:space="preserve"> Kim</w:t>
+      </w:r>
+      <w:r>
+        <w:rPr>
+          <w:rFonts w:ascii="Cambria" w:hAnsi="Cambria" w:cs="Arial"/>
+        </w:rPr>
         <w:t xml:space="preserve">, </w:t>
       </w:r>
-      <w:proofErr w:type="spellStart"/>
-      <w:r>
-        <w:rPr>
-          <w:rFonts w:ascii="Cambria" w:hAnsi="Cambria" w:cs="Arial"/>
-        </w:rPr>
-        <w:t>Soobum</w:t>
-      </w:r>
-      <w:proofErr w:type="spellEnd"/>
-      <w:r>
-        <w:rPr>
-          <w:rFonts w:ascii="Cambria" w:hAnsi="Cambria" w:cs="Arial"/>
-        </w:rPr>
-        <w:t xml:space="preserve"> Kim</w:t>
+      <w:r>
+        <w:rPr>
+          <w:rFonts w:ascii="Cambria" w:hAnsi="Cambria" w:cs="Arial"/>
+        </w:rPr>
+        <w:t>Sean Wilson, Samuel Coogan</w:t>
       </w:r>
     </w:p>
     <w:p>
@@ -196,12 +216,6 @@
           <w:rFonts w:ascii="Cambria" w:hAnsi="Cambria" w:cs="Arial"/>
         </w:rPr>
       </w:pPr>
-      <w:r>
-        <w:rPr>
-          <w:rFonts w:ascii="Cambria" w:hAnsi="Cambria" w:cs="Arial"/>
-        </w:rPr>
-        <w:t>Dr. Sean Wilson, Dr. Samuel Coogan</w:t>
-      </w:r>
     </w:p>
     <w:p>
       <w:pPr>
@@ -210,19 +224,11 @@
           <w:rFonts w:ascii="Cambria" w:hAnsi="Cambria" w:cs="Arial"/>
         </w:rPr>
       </w:pPr>
-    </w:p>
-    <w:p>
-      <w:pPr>
-        <w:jc w:val="center"/>
-        <w:rPr>
-          <w:rFonts w:ascii="Cambria" w:hAnsi="Cambria" w:cs="Arial"/>
-        </w:rPr>
-      </w:pPr>
-      <w:r>
-        <w:rPr>
-          <w:rFonts w:ascii="Cambria" w:hAnsi="Cambria" w:cs="Arial"/>
-        </w:rPr>
-        <w:t>April</w:t>
+      <w:r>
+        <w:rPr>
+          <w:rFonts w:ascii="Cambria" w:hAnsi="Cambria" w:cs="Arial"/>
+        </w:rPr>
+        <w:t>October</w:t>
       </w:r>
       <w:r>
         <w:rPr>
@@ -5858,7 +5864,19 @@
         <w:rPr>
           <w:rFonts w:ascii="Cambria" w:hAnsi="Cambria" w:cs="Arial"/>
         </w:rPr>
-        <w:t>2x 100:1 Motors</w:t>
+        <w:t>1x 3.7V Li</w:t>
+      </w:r>
+      <w:r>
+        <w:rPr>
+          <w:rFonts w:ascii="Cambria" w:hAnsi="Cambria" w:cs="Arial"/>
+        </w:rPr>
+        <w:t>P</w:t>
+      </w:r>
+      <w:r>
+        <w:rPr>
+          <w:rFonts w:ascii="Cambria" w:hAnsi="Cambria" w:cs="Arial"/>
+        </w:rPr>
+        <w:t>o Battery</w:t>
       </w:r>
     </w:p>
     <w:p>
@@ -5876,19 +5894,7 @@
         <w:rPr>
           <w:rFonts w:ascii="Cambria" w:hAnsi="Cambria" w:cs="Arial"/>
         </w:rPr>
-        <w:t>1x 3.7V Li</w:t>
-      </w:r>
-      <w:r>
-        <w:rPr>
-          <w:rFonts w:ascii="Cambria" w:hAnsi="Cambria" w:cs="Arial"/>
-        </w:rPr>
-        <w:t>P</w:t>
-      </w:r>
-      <w:r>
-        <w:rPr>
-          <w:rFonts w:ascii="Cambria" w:hAnsi="Cambria" w:cs="Arial"/>
-        </w:rPr>
-        <w:t>o Battery</w:t>
+        <w:t>1x Teensy 4.0 board with pins soldered</w:t>
       </w:r>
     </w:p>
     <w:p>
@@ -5906,16 +5912,8 @@
         <w:rPr>
           <w:rFonts w:ascii="Cambria" w:hAnsi="Cambria" w:cs="Arial"/>
         </w:rPr>
-        <w:t xml:space="preserve">1x Teensy 4.0 board with pins </w:t>
-      </w:r>
-      <w:proofErr w:type="gramStart"/>
-      <w:r>
-        <w:rPr>
-          <w:rFonts w:ascii="Cambria" w:hAnsi="Cambria" w:cs="Arial"/>
-        </w:rPr>
-        <w:t>soldered</w:t>
-      </w:r>
-      <w:proofErr w:type="gramEnd"/>
+        <w:t>1x Raspberry Pi (3B, 3B+, 4)</w:t>
+      </w:r>
     </w:p>
     <w:p>
       <w:pPr>
@@ -5932,7 +5930,13 @@
         <w:rPr>
           <w:rFonts w:ascii="Cambria" w:hAnsi="Cambria" w:cs="Arial"/>
         </w:rPr>
-        <w:t>1x Pack of two wheels</w:t>
+        <w:t xml:space="preserve">1x JST SH Jumper </w:t>
+      </w:r>
+      <w:r>
+        <w:rPr>
+          <w:rFonts w:ascii="Cambria" w:hAnsi="Cambria" w:cs="Arial"/>
+        </w:rPr>
+        <w:t>Wire</w:t>
       </w:r>
     </w:p>
     <w:p>
@@ -5950,7 +5954,33 @@
         <w:rPr>
           <w:rFonts w:ascii="Cambria" w:hAnsi="Cambria" w:cs="Arial"/>
         </w:rPr>
-        <w:t>1x Raspberry Pi (3B, 3B+, 4)</w:t>
+        <w:t xml:space="preserve">7x </w:t>
+      </w:r>
+      <w:r>
+        <w:rPr>
+          <w:rFonts w:ascii="Cambria" w:hAnsi="Cambria" w:cs="Arial"/>
+        </w:rPr>
+        <w:t>Time of Flight (</w:t>
+      </w:r>
+      <w:proofErr w:type="spellStart"/>
+      <w:r>
+        <w:rPr>
+          <w:rFonts w:ascii="Cambria" w:hAnsi="Cambria" w:cs="Arial"/>
+        </w:rPr>
+        <w:t>ToF</w:t>
+      </w:r>
+      <w:proofErr w:type="spellEnd"/>
+      <w:r>
+        <w:rPr>
+          <w:rFonts w:ascii="Cambria" w:hAnsi="Cambria" w:cs="Arial"/>
+        </w:rPr>
+        <w:t>)</w:t>
+      </w:r>
+      <w:r>
+        <w:rPr>
+          <w:rFonts w:ascii="Cambria" w:hAnsi="Cambria" w:cs="Arial"/>
+        </w:rPr>
+        <w:t xml:space="preserve"> distance sensors</w:t>
       </w:r>
     </w:p>
     <w:p>
@@ -5968,13 +5998,27 @@
         <w:rPr>
           <w:rFonts w:ascii="Cambria" w:hAnsi="Cambria" w:cs="Arial"/>
         </w:rPr>
-        <w:t xml:space="preserve">1x JST SH Jumper </w:t>
-      </w:r>
-      <w:r>
-        <w:rPr>
-          <w:rFonts w:ascii="Cambria" w:hAnsi="Cambria" w:cs="Arial"/>
-        </w:rPr>
-        <w:t>Wire</w:t>
+        <w:t xml:space="preserve">7x 50mm or shorter </w:t>
+      </w:r>
+      <w:proofErr w:type="spellStart"/>
+      <w:r>
+        <w:rPr>
+          <w:rFonts w:ascii="Cambria" w:hAnsi="Cambria" w:cs="Arial"/>
+        </w:rPr>
+        <w:t>Qwiic</w:t>
+      </w:r>
+      <w:proofErr w:type="spellEnd"/>
+      <w:r>
+        <w:rPr>
+          <w:rFonts w:ascii="Cambria" w:hAnsi="Cambria" w:cs="Arial"/>
+        </w:rPr>
+        <w:t xml:space="preserve"> connector </w:t>
+      </w:r>
+      <w:r>
+        <w:rPr>
+          <w:rFonts w:ascii="Cambria" w:hAnsi="Cambria" w:cs="Arial"/>
+        </w:rPr>
+        <w:t>cables</w:t>
       </w:r>
     </w:p>
     <w:p>
@@ -5992,33 +6036,7 @@
         <w:rPr>
           <w:rFonts w:ascii="Cambria" w:hAnsi="Cambria" w:cs="Arial"/>
         </w:rPr>
-        <w:t xml:space="preserve">7x </w:t>
-      </w:r>
-      <w:r>
-        <w:rPr>
-          <w:rFonts w:ascii="Cambria" w:hAnsi="Cambria" w:cs="Arial"/>
-        </w:rPr>
-        <w:t>Time of Flight (</w:t>
-      </w:r>
-      <w:proofErr w:type="spellStart"/>
-      <w:r>
-        <w:rPr>
-          <w:rFonts w:ascii="Cambria" w:hAnsi="Cambria" w:cs="Arial"/>
-        </w:rPr>
-        <w:t>ToF</w:t>
-      </w:r>
-      <w:proofErr w:type="spellEnd"/>
-      <w:r>
-        <w:rPr>
-          <w:rFonts w:ascii="Cambria" w:hAnsi="Cambria" w:cs="Arial"/>
-        </w:rPr>
-        <w:t>)</w:t>
-      </w:r>
-      <w:r>
-        <w:rPr>
-          <w:rFonts w:ascii="Cambria" w:hAnsi="Cambria" w:cs="Arial"/>
-        </w:rPr>
-        <w:t xml:space="preserve"> distance sensors</w:t>
+        <w:t>1x Front Caster Pack</w:t>
       </w:r>
     </w:p>
     <w:p>
@@ -6036,27 +6054,7 @@
         <w:rPr>
           <w:rFonts w:ascii="Cambria" w:hAnsi="Cambria" w:cs="Arial"/>
         </w:rPr>
-        <w:t xml:space="preserve">7x 50mm or shorter </w:t>
-      </w:r>
-      <w:proofErr w:type="spellStart"/>
-      <w:r>
-        <w:rPr>
-          <w:rFonts w:ascii="Cambria" w:hAnsi="Cambria" w:cs="Arial"/>
-        </w:rPr>
-        <w:t>Qwiic</w:t>
-      </w:r>
-      <w:proofErr w:type="spellEnd"/>
-      <w:r>
-        <w:rPr>
-          <w:rFonts w:ascii="Cambria" w:hAnsi="Cambria" w:cs="Arial"/>
-        </w:rPr>
-        <w:t xml:space="preserve"> connector </w:t>
-      </w:r>
-      <w:r>
-        <w:rPr>
-          <w:rFonts w:ascii="Cambria" w:hAnsi="Cambria" w:cs="Arial"/>
-        </w:rPr>
-        <w:t>cables</w:t>
+        <w:t>3x Small Caster Springs</w:t>
       </w:r>
     </w:p>
     <w:p>
@@ -6074,7 +6072,7 @@
         <w:rPr>
           <w:rFonts w:ascii="Cambria" w:hAnsi="Cambria" w:cs="Arial"/>
         </w:rPr>
-        <w:t>1x Front Caster Pack</w:t>
+        <w:t>3x M3x20mm Screws</w:t>
       </w:r>
     </w:p>
     <w:p>
@@ -6092,7 +6090,7 @@
         <w:rPr>
           <w:rFonts w:ascii="Cambria" w:hAnsi="Cambria" w:cs="Arial"/>
         </w:rPr>
-        <w:t>3x Small Caster Springs</w:t>
+        <w:t>3x M3 Locknuts</w:t>
       </w:r>
     </w:p>
     <w:p>
@@ -6110,7 +6108,43 @@
         <w:rPr>
           <w:rFonts w:ascii="Cambria" w:hAnsi="Cambria" w:cs="Arial"/>
         </w:rPr>
-        <w:t>3x M3 Locknuts</w:t>
+        <w:t>2x 100:1 Motors</w:t>
+      </w:r>
+    </w:p>
+    <w:p>
+      <w:pPr>
+        <w:pStyle w:val="ListParagraph"/>
+        <w:numPr>
+          <w:ilvl w:val="0"/>
+          <w:numId w:val="1"/>
+        </w:numPr>
+        <w:rPr>
+          <w:rFonts w:ascii="Cambria" w:hAnsi="Cambria" w:cs="Arial"/>
+        </w:rPr>
+      </w:pPr>
+      <w:r>
+        <w:rPr>
+          <w:rFonts w:ascii="Cambria" w:hAnsi="Cambria" w:cs="Arial"/>
+        </w:rPr>
+        <w:t>1x Pack of two motor mounts</w:t>
+      </w:r>
+    </w:p>
+    <w:p>
+      <w:pPr>
+        <w:pStyle w:val="ListParagraph"/>
+        <w:numPr>
+          <w:ilvl w:val="0"/>
+          <w:numId w:val="1"/>
+        </w:numPr>
+        <w:rPr>
+          <w:rFonts w:ascii="Cambria" w:hAnsi="Cambria" w:cs="Arial"/>
+        </w:rPr>
+      </w:pPr>
+      <w:r>
+        <w:rPr>
+          <w:rFonts w:ascii="Cambria" w:hAnsi="Cambria" w:cs="Arial"/>
+        </w:rPr>
+        <w:t>1x Pack of two wheels</w:t>
       </w:r>
     </w:p>
     <w:p>
@@ -7032,7 +7066,7 @@
               </wp:inline>
             </w:drawing>
           </mc:Choice>
-          <mc:Fallback xmlns:a="http://schemas.openxmlformats.org/drawingml/2006/main" xmlns:pic="http://schemas.openxmlformats.org/drawingml/2006/picture" xmlns:a14="http://schemas.microsoft.com/office/drawing/2010/main" xmlns:a16="http://schemas.microsoft.com/office/drawing/2014/main">
+          <mc:Fallback xmlns:a16="http://schemas.microsoft.com/office/drawing/2014/main" xmlns:a14="http://schemas.microsoft.com/office/drawing/2010/main" xmlns:pic="http://schemas.openxmlformats.org/drawingml/2006/picture" xmlns:a="http://schemas.openxmlformats.org/drawingml/2006/main">
             <w:pict w14:anchorId="106345E4">
               <v:group id="Group 6" style="width:187.5pt;height:180pt;mso-position-horizontal-relative:char;mso-position-vertical-relative:line" alt="A red outline of a machine" coordsize="23812,22860" o:spid="_x0000_s1026" w14:anchorId="4412AB56" o:gfxdata="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">
                 <v:shapetype id="_x0000_t75" coordsize="21600,21600" filled="f" stroked="f" o:spt="75" o:preferrelative="t" path="m@4@5l@4@11@9@11@9@5xe">
@@ -7608,7 +7642,7 @@
               </wp:inline>
             </w:drawing>
           </mc:Choice>
-          <mc:Fallback xmlns:a="http://schemas.openxmlformats.org/drawingml/2006/main" xmlns:pic="http://schemas.openxmlformats.org/drawingml/2006/picture" xmlns:a14="http://schemas.microsoft.com/office/drawing/2010/main" xmlns:a16="http://schemas.microsoft.com/office/drawing/2014/main">
+          <mc:Fallback xmlns:a16="http://schemas.microsoft.com/office/drawing/2014/main" xmlns:a14="http://schemas.microsoft.com/office/drawing/2010/main" xmlns:pic="http://schemas.openxmlformats.org/drawingml/2006/picture" xmlns:a="http://schemas.openxmlformats.org/drawingml/2006/main">
             <w:pict w14:anchorId="54BBED3B">
               <v:group id="Group 9" style="width:152.5pt;height:167.25pt;mso-position-horizontal-relative:char;mso-position-vertical-relative:line" coordsize="19367,21240" o:spid="_x0000_s1026" w14:anchorId="284ABC37" o:gfxdata="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">
                 <v:shapetype id="_x0000_t75" coordsize="21600,21600" filled="f" stroked="f" o:spt="75" o:preferrelative="t" path="m@4@5l@4@11@9@11@9@5xe">
@@ -8297,7 +8331,7 @@
           <w:noProof/>
         </w:rPr>
         <w:drawing>
-          <wp:inline distT="0" distB="0" distL="0" distR="0" wp14:anchorId="211CB0DD" wp14:editId="787AF2B0">
+          <wp:inline distT="0" distB="0" distL="0" distR="0" wp14:anchorId="211CB0DD" wp14:editId="5B1840F8">
             <wp:extent cx="1835875" cy="2801722"/>
             <wp:effectExtent l="0" t="6667" r="5397" b="5398"/>
             <wp:docPr id="1009108283" name="Picture 1009108283" descr="A blue and white object&#10;&#10;Description automatically generated"/>
@@ -9530,7 +9564,7 @@
               </wp:inline>
             </w:drawing>
           </mc:Choice>
-          <mc:Fallback xmlns:a="http://schemas.openxmlformats.org/drawingml/2006/main" xmlns:pic="http://schemas.openxmlformats.org/drawingml/2006/picture" xmlns:a14="http://schemas.microsoft.com/office/drawing/2010/main" xmlns:a16="http://schemas.microsoft.com/office/drawing/2014/main">
+          <mc:Fallback xmlns:a16="http://schemas.microsoft.com/office/drawing/2014/main" xmlns:a14="http://schemas.microsoft.com/office/drawing/2010/main" xmlns:pic="http://schemas.openxmlformats.org/drawingml/2006/picture" xmlns:a="http://schemas.openxmlformats.org/drawingml/2006/main">
             <w:pict w14:anchorId="1EB6C35E">
               <v:group id="Group 14" style="width:181.5pt;height:180pt;mso-position-horizontal-relative:char;mso-position-vertical-relative:line" coordsize="23050,22860" o:spid="_x0000_s1026" w14:anchorId="3A6EA499" o:gfxdata="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">
                 <v:shape id="Picture 1570605880" style="position:absolute;width:23050;height:22860;visibility:visible;mso-wrap-style:square" alt="A red outline of a piece of paper&#10;&#10;Description automatically generated" o:spid="_x0000_s1027" type="#_x0000_t75" o:gfxdata="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">
@@ -9610,7 +9644,228 @@
         <w:rPr>
           <w:rFonts w:ascii="Cambria" w:hAnsi="Cambria" w:cs="Arial"/>
         </w:rPr>
-        <w:t xml:space="preserve">using the screws provided with the brackets. </w:t>
+        <w:t>using the screws provided with the brackets.</w:t>
+      </w:r>
+      <w:r>
+        <w:rPr>
+          <w:rFonts w:ascii="Cambria" w:hAnsi="Cambria" w:cs="Arial"/>
+        </w:rPr>
+        <w:br/>
+      </w:r>
+      <w:r>
+        <w:rPr>
+          <w:rFonts w:ascii="Cambria" w:hAnsi="Cambria" w:cs="Arial"/>
+        </w:rPr>
+        <w:br/>
+      </w:r>
+      <w:r>
+        <w:rPr>
+          <w:rFonts w:ascii="Cambria" w:hAnsi="Cambria" w:cs="Arial"/>
+          <w:noProof/>
+        </w:rPr>
+        <w:drawing>
+          <wp:inline distT="0" distB="0" distL="0" distR="0" wp14:anchorId="22C5092F" wp14:editId="62C1C592">
+            <wp:extent cx="1711921" cy="1501125"/>
+            <wp:effectExtent l="0" t="0" r="3175" b="0"/>
+            <wp:docPr id="276893208" name="Picture 7" descr="A small metal and gold motor&#10;&#10;Description automatically generated with medium confidence"/>
+            <wp:cNvGraphicFramePr>
+              <a:graphicFrameLocks xmlns:a="http://schemas.openxmlformats.org/drawingml/2006/main" noChangeAspect="1"/>
+            </wp:cNvGraphicFramePr>
+            <a:graphic xmlns:a="http://schemas.openxmlformats.org/drawingml/2006/main">
+              <a:graphicData uri="http://schemas.openxmlformats.org/drawingml/2006/picture">
+                <pic:pic xmlns:pic="http://schemas.openxmlformats.org/drawingml/2006/picture">
+                  <pic:nvPicPr>
+                    <pic:cNvPr id="276893208" name="Picture 7" descr="A small metal and gold motor&#10;&#10;Description automatically generated with medium confidence"/>
+                    <pic:cNvPicPr/>
+                  </pic:nvPicPr>
+                  <pic:blipFill>
+                    <a:blip r:embed="rId35">
+                      <a:extLst>
+                        <a:ext uri="{28A0092B-C50C-407E-A947-70E740481C1C}">
+                          <a14:useLocalDpi xmlns:a14="http://schemas.microsoft.com/office/drawing/2010/main" val="0"/>
+                        </a:ext>
+                      </a:extLst>
+                    </a:blip>
+                    <a:stretch>
+                      <a:fillRect/>
+                    </a:stretch>
+                  </pic:blipFill>
+                  <pic:spPr>
+                    <a:xfrm>
+                      <a:off x="0" y="0"/>
+                      <a:ext cx="1731073" cy="1517919"/>
+                    </a:xfrm>
+                    <a:prstGeom prst="rect">
+                      <a:avLst/>
+                    </a:prstGeom>
+                  </pic:spPr>
+                </pic:pic>
+              </a:graphicData>
+            </a:graphic>
+          </wp:inline>
+        </w:drawing>
+      </w:r>
+      <w:r>
+        <w:rPr>
+          <w:rFonts w:ascii="Cambria" w:hAnsi="Cambria" w:cs="Arial"/>
+        </w:rPr>
+        <w:t xml:space="preserve">  </w:t>
+      </w:r>
+      <w:r>
+        <w:rPr>
+          <w:rFonts w:ascii="Cambria" w:hAnsi="Cambria" w:cs="Arial"/>
+          <w:noProof/>
+        </w:rPr>
+        <w:drawing>
+          <wp:inline distT="0" distB="0" distL="0" distR="0" wp14:anchorId="64790A85" wp14:editId="139C3485">
+            <wp:extent cx="2825702" cy="1498071"/>
+            <wp:effectExtent l="0" t="0" r="0" b="635"/>
+            <wp:docPr id="348236619" name="Picture 8" descr="A close-up of a device&#10;&#10;Description automatically generated"/>
+            <wp:cNvGraphicFramePr>
+              <a:graphicFrameLocks xmlns:a="http://schemas.openxmlformats.org/drawingml/2006/main" noChangeAspect="1"/>
+            </wp:cNvGraphicFramePr>
+            <a:graphic xmlns:a="http://schemas.openxmlformats.org/drawingml/2006/main">
+              <a:graphicData uri="http://schemas.openxmlformats.org/drawingml/2006/picture">
+                <pic:pic xmlns:pic="http://schemas.openxmlformats.org/drawingml/2006/picture">
+                  <pic:nvPicPr>
+                    <pic:cNvPr id="348236619" name="Picture 8" descr="A close-up of a device&#10;&#10;Description automatically generated"/>
+                    <pic:cNvPicPr/>
+                  </pic:nvPicPr>
+                  <pic:blipFill>
+                    <a:blip r:embed="rId36">
+                      <a:extLst>
+                        <a:ext uri="{28A0092B-C50C-407E-A947-70E740481C1C}">
+                          <a14:useLocalDpi xmlns:a14="http://schemas.microsoft.com/office/drawing/2010/main" val="0"/>
+                        </a:ext>
+                      </a:extLst>
+                    </a:blip>
+                    <a:stretch>
+                      <a:fillRect/>
+                    </a:stretch>
+                  </pic:blipFill>
+                  <pic:spPr>
+                    <a:xfrm>
+                      <a:off x="0" y="0"/>
+                      <a:ext cx="2880340" cy="1527038"/>
+                    </a:xfrm>
+                    <a:prstGeom prst="rect">
+                      <a:avLst/>
+                    </a:prstGeom>
+                  </pic:spPr>
+                </pic:pic>
+              </a:graphicData>
+            </a:graphic>
+          </wp:inline>
+        </w:drawing>
+      </w:r>
+    </w:p>
+    <w:p>
+      <w:pPr>
+        <w:pStyle w:val="ListParagraph"/>
+        <w:rPr>
+          <w:rFonts w:ascii="Cambria" w:hAnsi="Cambria" w:cs="Arial"/>
+        </w:rPr>
+      </w:pPr>
+      <w:r>
+        <w:rPr>
+          <w:rFonts w:ascii="Cambria" w:hAnsi="Cambria" w:cs="Arial"/>
+          <w:noProof/>
+        </w:rPr>
+        <w:lastRenderedPageBreak/>
+        <w:drawing>
+          <wp:inline distT="0" distB="0" distL="0" distR="0" wp14:anchorId="76B6B72D" wp14:editId="2DE12437">
+            <wp:extent cx="2185729" cy="1815050"/>
+            <wp:effectExtent l="0" t="0" r="0" b="1270"/>
+            <wp:docPr id="854760187" name="Picture 9" descr="A clear plastic device with metal parts&#10;&#10;Description automatically generated with medium confidence"/>
+            <wp:cNvGraphicFramePr>
+              <a:graphicFrameLocks xmlns:a="http://schemas.openxmlformats.org/drawingml/2006/main" noChangeAspect="1"/>
+            </wp:cNvGraphicFramePr>
+            <a:graphic xmlns:a="http://schemas.openxmlformats.org/drawingml/2006/main">
+              <a:graphicData uri="http://schemas.openxmlformats.org/drawingml/2006/picture">
+                <pic:pic xmlns:pic="http://schemas.openxmlformats.org/drawingml/2006/picture">
+                  <pic:nvPicPr>
+                    <pic:cNvPr id="854760187" name="Picture 9" descr="A clear plastic device with metal parts&#10;&#10;Description automatically generated with medium confidence"/>
+                    <pic:cNvPicPr/>
+                  </pic:nvPicPr>
+                  <pic:blipFill>
+                    <a:blip r:embed="rId37">
+                      <a:extLst>
+                        <a:ext uri="{28A0092B-C50C-407E-A947-70E740481C1C}">
+                          <a14:useLocalDpi xmlns:a14="http://schemas.microsoft.com/office/drawing/2010/main" val="0"/>
+                        </a:ext>
+                      </a:extLst>
+                    </a:blip>
+                    <a:stretch>
+                      <a:fillRect/>
+                    </a:stretch>
+                  </pic:blipFill>
+                  <pic:spPr>
+                    <a:xfrm>
+                      <a:off x="0" y="0"/>
+                      <a:ext cx="2195231" cy="1822941"/>
+                    </a:xfrm>
+                    <a:prstGeom prst="rect">
+                      <a:avLst/>
+                    </a:prstGeom>
+                  </pic:spPr>
+                </pic:pic>
+              </a:graphicData>
+            </a:graphic>
+          </wp:inline>
+        </w:drawing>
+      </w:r>
+      <w:r>
+        <w:rPr>
+          <w:rFonts w:ascii="Cambria" w:hAnsi="Cambria" w:cs="Arial"/>
+        </w:rPr>
+        <w:t xml:space="preserve">  </w:t>
+      </w:r>
+      <w:r>
+        <w:rPr>
+          <w:rFonts w:ascii="Cambria" w:hAnsi="Cambria" w:cs="Arial"/>
+          <w:noProof/>
+        </w:rPr>
+        <w:drawing>
+          <wp:inline distT="0" distB="0" distL="0" distR="0" wp14:anchorId="4D39F36C" wp14:editId="491BD067">
+            <wp:extent cx="2963342" cy="1814589"/>
+            <wp:effectExtent l="0" t="0" r="0" b="1905"/>
+            <wp:docPr id="2067698315" name="Picture 10" descr="A close-up of a plastic device&#10;&#10;Description automatically generated"/>
+            <wp:cNvGraphicFramePr>
+              <a:graphicFrameLocks xmlns:a="http://schemas.openxmlformats.org/drawingml/2006/main" noChangeAspect="1"/>
+            </wp:cNvGraphicFramePr>
+            <a:graphic xmlns:a="http://schemas.openxmlformats.org/drawingml/2006/main">
+              <a:graphicData uri="http://schemas.openxmlformats.org/drawingml/2006/picture">
+                <pic:pic xmlns:pic="http://schemas.openxmlformats.org/drawingml/2006/picture">
+                  <pic:nvPicPr>
+                    <pic:cNvPr id="2067698315" name="Picture 10" descr="A close-up of a plastic device&#10;&#10;Description automatically generated"/>
+                    <pic:cNvPicPr/>
+                  </pic:nvPicPr>
+                  <pic:blipFill>
+                    <a:blip r:embed="rId38">
+                      <a:extLst>
+                        <a:ext uri="{28A0092B-C50C-407E-A947-70E740481C1C}">
+                          <a14:useLocalDpi xmlns:a14="http://schemas.microsoft.com/office/drawing/2010/main" val="0"/>
+                        </a:ext>
+                      </a:extLst>
+                    </a:blip>
+                    <a:stretch>
+                      <a:fillRect/>
+                    </a:stretch>
+                  </pic:blipFill>
+                  <pic:spPr>
+                    <a:xfrm>
+                      <a:off x="0" y="0"/>
+                      <a:ext cx="3080091" cy="1886080"/>
+                    </a:xfrm>
+                    <a:prstGeom prst="rect">
+                      <a:avLst/>
+                    </a:prstGeom>
+                  </pic:spPr>
+                </pic:pic>
+              </a:graphicData>
+            </a:graphic>
+          </wp:inline>
+        </w:drawing>
       </w:r>
     </w:p>
     <w:p>
@@ -9686,7 +9941,7 @@
         <w:rPr>
           <w:rFonts w:ascii="Cambria" w:hAnsi="Cambria" w:cs="Arial"/>
         </w:rPr>
-        <w:t xml:space="preserve">. </w:t>
+        <w:t>.</w:t>
       </w:r>
     </w:p>
     <w:p>
@@ -9802,6 +10057,59 @@
         </w:rPr>
         <w:t>top of the ball in each of the edge locations.</w:t>
       </w:r>
+      <w:r>
+        <w:rPr>
+          <w:rFonts w:ascii="Cambria" w:hAnsi="Cambria" w:cs="Arial"/>
+        </w:rPr>
+        <w:br/>
+      </w:r>
+      <w:r>
+        <w:rPr>
+          <w:rFonts w:ascii="Cambria" w:hAnsi="Cambria" w:cs="Arial"/>
+          <w:noProof/>
+        </w:rPr>
+        <w:drawing>
+          <wp:inline distT="0" distB="0" distL="0" distR="0" wp14:anchorId="00417216" wp14:editId="1CCD6821">
+            <wp:extent cx="1731908" cy="1466735"/>
+            <wp:effectExtent l="0" t="0" r="0" b="0"/>
+            <wp:docPr id="320060501" name="Picture 11" descr="A metal ball in a triangle&#10;&#10;Description automatically generated"/>
+            <wp:cNvGraphicFramePr>
+              <a:graphicFrameLocks xmlns:a="http://schemas.openxmlformats.org/drawingml/2006/main" noChangeAspect="1"/>
+            </wp:cNvGraphicFramePr>
+            <a:graphic xmlns:a="http://schemas.openxmlformats.org/drawingml/2006/main">
+              <a:graphicData uri="http://schemas.openxmlformats.org/drawingml/2006/picture">
+                <pic:pic xmlns:pic="http://schemas.openxmlformats.org/drawingml/2006/picture">
+                  <pic:nvPicPr>
+                    <pic:cNvPr id="320060501" name="Picture 11" descr="A metal ball in a triangle&#10;&#10;Description automatically generated"/>
+                    <pic:cNvPicPr/>
+                  </pic:nvPicPr>
+                  <pic:blipFill>
+                    <a:blip r:embed="rId39">
+                      <a:extLst>
+                        <a:ext uri="{28A0092B-C50C-407E-A947-70E740481C1C}">
+                          <a14:useLocalDpi xmlns:a14="http://schemas.microsoft.com/office/drawing/2010/main" val="0"/>
+                        </a:ext>
+                      </a:extLst>
+                    </a:blip>
+                    <a:stretch>
+                      <a:fillRect/>
+                    </a:stretch>
+                  </pic:blipFill>
+                  <pic:spPr>
+                    <a:xfrm>
+                      <a:off x="0" y="0"/>
+                      <a:ext cx="1749301" cy="1481465"/>
+                    </a:xfrm>
+                    <a:prstGeom prst="rect">
+                      <a:avLst/>
+                    </a:prstGeom>
+                  </pic:spPr>
+                </pic:pic>
+              </a:graphicData>
+            </a:graphic>
+          </wp:inline>
+        </w:drawing>
+      </w:r>
     </w:p>
     <w:p>
       <w:pPr>
@@ -9908,7 +10216,6 @@
         <w:rPr>
           <w:rFonts w:ascii="Cambria" w:hAnsi="Cambria" w:cs="Arial"/>
         </w:rPr>
-        <w:lastRenderedPageBreak/>
         <w:t>P</w:t>
       </w:r>
       <w:r>
@@ -10019,14 +10326,113 @@
         </w:rPr>
         <w:t xml:space="preserve"> Locknuts.</w:t>
       </w:r>
-    </w:p>
-    <w:p>
-      <w:pPr>
-        <w:jc w:val="center"/>
-        <w:rPr>
-          <w:rFonts w:ascii="Cambria" w:hAnsi="Cambria" w:cs="Arial"/>
-        </w:rPr>
-      </w:pPr>
+      <w:r>
+        <w:rPr>
+          <w:rFonts w:ascii="Cambria" w:hAnsi="Cambria" w:cs="Arial"/>
+        </w:rPr>
+        <w:br/>
+      </w:r>
+      <w:r>
+        <w:rPr>
+          <w:rFonts w:ascii="Cambria" w:hAnsi="Cambria" w:cs="Arial"/>
+          <w:noProof/>
+        </w:rPr>
+        <w:lastRenderedPageBreak/>
+        <w:drawing>
+          <wp:inline distT="0" distB="0" distL="0" distR="0" wp14:anchorId="24AFA6C6" wp14:editId="59E35505">
+            <wp:extent cx="1423164" cy="1359267"/>
+            <wp:effectExtent l="0" t="0" r="0" b="0"/>
+            <wp:docPr id="2108796162" name="Picture 12" descr="A close-up of a black and silver object&#10;&#10;Description automatically generated"/>
+            <wp:cNvGraphicFramePr>
+              <a:graphicFrameLocks xmlns:a="http://schemas.openxmlformats.org/drawingml/2006/main" noChangeAspect="1"/>
+            </wp:cNvGraphicFramePr>
+            <a:graphic xmlns:a="http://schemas.openxmlformats.org/drawingml/2006/main">
+              <a:graphicData uri="http://schemas.openxmlformats.org/drawingml/2006/picture">
+                <pic:pic xmlns:pic="http://schemas.openxmlformats.org/drawingml/2006/picture">
+                  <pic:nvPicPr>
+                    <pic:cNvPr id="2108796162" name="Picture 12" descr="A close-up of a black and silver object&#10;&#10;Description automatically generated"/>
+                    <pic:cNvPicPr/>
+                  </pic:nvPicPr>
+                  <pic:blipFill>
+                    <a:blip r:embed="rId40">
+                      <a:extLst>
+                        <a:ext uri="{28A0092B-C50C-407E-A947-70E740481C1C}">
+                          <a14:useLocalDpi xmlns:a14="http://schemas.microsoft.com/office/drawing/2010/main" val="0"/>
+                        </a:ext>
+                      </a:extLst>
+                    </a:blip>
+                    <a:stretch>
+                      <a:fillRect/>
+                    </a:stretch>
+                  </pic:blipFill>
+                  <pic:spPr>
+                    <a:xfrm>
+                      <a:off x="0" y="0"/>
+                      <a:ext cx="1484047" cy="1417417"/>
+                    </a:xfrm>
+                    <a:prstGeom prst="rect">
+                      <a:avLst/>
+                    </a:prstGeom>
+                  </pic:spPr>
+                </pic:pic>
+              </a:graphicData>
+            </a:graphic>
+          </wp:inline>
+        </w:drawing>
+      </w:r>
+      <w:r>
+        <w:rPr>
+          <w:rFonts w:ascii="Cambria" w:hAnsi="Cambria" w:cs="Arial"/>
+        </w:rPr>
+        <w:t xml:space="preserve">  </w:t>
+      </w:r>
+      <w:r>
+        <w:rPr>
+          <w:rFonts w:ascii="Cambria" w:hAnsi="Cambria" w:cs="Arial"/>
+          <w:noProof/>
+        </w:rPr>
+        <w:drawing>
+          <wp:inline distT="0" distB="0" distL="0" distR="0" wp14:anchorId="16A4EDF6" wp14:editId="260A42EB">
+            <wp:extent cx="2731025" cy="1352966"/>
+            <wp:effectExtent l="0" t="0" r="0" b="6350"/>
+            <wp:docPr id="1890600079" name="Picture 13" descr="A clear plastic plate with screws and bolts&#10;&#10;Description automatically generated"/>
+            <wp:cNvGraphicFramePr>
+              <a:graphicFrameLocks xmlns:a="http://schemas.openxmlformats.org/drawingml/2006/main" noChangeAspect="1"/>
+            </wp:cNvGraphicFramePr>
+            <a:graphic xmlns:a="http://schemas.openxmlformats.org/drawingml/2006/main">
+              <a:graphicData uri="http://schemas.openxmlformats.org/drawingml/2006/picture">
+                <pic:pic xmlns:pic="http://schemas.openxmlformats.org/drawingml/2006/picture">
+                  <pic:nvPicPr>
+                    <pic:cNvPr id="1890600079" name="Picture 13" descr="A clear plastic plate with screws and bolts&#10;&#10;Description automatically generated"/>
+                    <pic:cNvPicPr/>
+                  </pic:nvPicPr>
+                  <pic:blipFill>
+                    <a:blip r:embed="rId41">
+                      <a:extLst>
+                        <a:ext uri="{28A0092B-C50C-407E-A947-70E740481C1C}">
+                          <a14:useLocalDpi xmlns:a14="http://schemas.microsoft.com/office/drawing/2010/main" val="0"/>
+                        </a:ext>
+                      </a:extLst>
+                    </a:blip>
+                    <a:stretch>
+                      <a:fillRect/>
+                    </a:stretch>
+                  </pic:blipFill>
+                  <pic:spPr>
+                    <a:xfrm>
+                      <a:off x="0" y="0"/>
+                      <a:ext cx="2773688" cy="1374101"/>
+                    </a:xfrm>
+                    <a:prstGeom prst="rect">
+                      <a:avLst/>
+                    </a:prstGeom>
+                  </pic:spPr>
+                </pic:pic>
+              </a:graphicData>
+            </a:graphic>
+          </wp:inline>
+        </w:drawing>
+      </w:r>
       <w:r>
         <w:rPr>
           <w:rFonts w:ascii="Cambria" w:hAnsi="Cambria" w:cs="Arial"/>
@@ -10035,7 +10441,7 @@
         <mc:AlternateContent>
           <mc:Choice Requires="wpg">
             <w:drawing>
-              <wp:inline distT="0" distB="0" distL="0" distR="0" wp14:anchorId="3D8FA6D9" wp14:editId="65030323">
+              <wp:inline distT="0" distB="0" distL="0" distR="0" wp14:anchorId="42679F58" wp14:editId="1C58CF82">
                 <wp:extent cx="2305050" cy="2286000"/>
                 <wp:effectExtent l="0" t="0" r="0" b="0"/>
                 <wp:docPr id="7" name="Group 7">
@@ -10141,13 +10547,32 @@
               </wp:inline>
             </w:drawing>
           </mc:Choice>
-          <mc:Fallback xmlns:a="http://schemas.openxmlformats.org/drawingml/2006/main" xmlns:pic="http://schemas.openxmlformats.org/drawingml/2006/picture" xmlns:a14="http://schemas.microsoft.com/office/drawing/2010/main" xmlns:a16="http://schemas.microsoft.com/office/drawing/2014/main">
-            <w:pict w14:anchorId="79CBDEAE">
-              <v:group id="Group 7" style="width:181.5pt;height:180pt;mso-position-horizontal-relative:char;mso-position-vertical-relative:line" coordsize="23050,22860" o:spid="_x0000_s1026" w14:anchorId="7A434633" o:gfxdata="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">
-                <v:shape id="Picture 134499470" style="position:absolute;width:23050;height:22860;visibility:visible;mso-wrap-style:square" alt="A red outline of a piece of paper&#10;&#10;Description automatically generated" o:spid="_x0000_s1027" type="#_x0000_t75" o:gfxdata="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">
-                  <v:imagedata o:title="A red outline of a piece of paper&#10;&#10;Description automatically generated" r:id="rId34"/>
+          <mc:Fallback>
+            <w:pict>
+              <v:group w14:anchorId="361DA195" id="Group 7" o:spid="_x0000_s1026" style="width:181.5pt;height:180pt;mso-position-horizontal-relative:char;mso-position-vertical-relative:line" coordsize="23050,22860" o:gfxdata="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">
+                <v:shapetype id="_x0000_t75" coordsize="21600,21600" o:spt="75" o:preferrelative="t" path="m@4@5l@4@11@9@11@9@5xe" filled="f" stroked="f">
+                  <v:stroke joinstyle="miter"/>
+                  <v:formulas>
+                    <v:f eqn="if lineDrawn pixelLineWidth 0"/>
+                    <v:f eqn="sum @0 1 0"/>
+                    <v:f eqn="sum 0 0 @1"/>
+                    <v:f eqn="prod @2 1 2"/>
+                    <v:f eqn="prod @3 21600 pixelWidth"/>
+                    <v:f eqn="prod @3 21600 pixelHeight"/>
+                    <v:f eqn="sum @0 0 1"/>
+                    <v:f eqn="prod @6 1 2"/>
+                    <v:f eqn="prod @7 21600 pixelWidth"/>
+                    <v:f eqn="sum @8 21600 0"/>
+                    <v:f eqn="prod @7 21600 pixelHeight"/>
+                    <v:f eqn="sum @10 21600 0"/>
+                  </v:formulas>
+                  <v:path o:extrusionok="f" gradientshapeok="t" o:connecttype="rect"/>
+                  <o:lock v:ext="edit" aspectratio="t"/>
+                </v:shapetype>
+                <v:shape id="Picture 134499470" o:spid="_x0000_s1027" type="#_x0000_t75" alt="A red outline of a piece of paper&#10;&#10;Description automatically generated" style="position:absolute;width:23050;height:22860;visibility:visible;mso-wrap-style:square" o:gfxdata="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">
+                  <v:imagedata r:id="rId42" o:title="A red outline of a piece of paper&#10;&#10;Description automatically generated"/>
                 </v:shape>
-                <v:rect id="Rectangle 1854711237" style="position:absolute;left:8643;top:571;width:5858;height:5858;visibility:visible;mso-wrap-style:square;v-text-anchor:middle" o:spid="_x0000_s1028" filled="f" strokecolor="#00b050" strokeweight="1pt" o:gfxdata="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"/>
+                <v:rect id="Rectangle 1854711237" o:spid="_x0000_s1028" style="position:absolute;left:8643;top:571;width:5858;height:5858;visibility:visible;mso-wrap-style:square;v-text-anchor:middle" o:gfxdata="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" filled="f" strokecolor="#00b050" strokeweight="1pt"/>
                 <w10:anchorlock/>
               </v:group>
             </w:pict>
@@ -10159,7 +10584,7 @@
       <w:pPr>
         <w:pStyle w:val="ListParagraph"/>
         <w:numPr>
-          <w:ilvl w:val="0"/>
+          <w:ilvl w:val="1"/>
           <w:numId w:val="2"/>
         </w:numPr>
         <w:rPr>
@@ -10170,84 +10595,65 @@
         <w:rPr>
           <w:rFonts w:ascii="Cambria" w:hAnsi="Cambria" w:cs="Arial"/>
         </w:rPr>
-        <w:t>Place</w:t>
-      </w:r>
-      <w:r>
-        <w:rPr>
-          <w:rFonts w:ascii="Cambria" w:hAnsi="Cambria" w:cs="Arial"/>
-        </w:rPr>
-        <w:t xml:space="preserve"> the</w:t>
-      </w:r>
-      <w:r>
-        <w:rPr>
-          <w:rFonts w:ascii="Cambria" w:hAnsi="Cambria" w:cs="Arial"/>
-        </w:rPr>
-        <w:t xml:space="preserve"> bottom</w:t>
-      </w:r>
-      <w:r>
-        <w:rPr>
-          <w:rFonts w:ascii="Cambria" w:hAnsi="Cambria" w:cs="Arial"/>
-        </w:rPr>
-        <w:t xml:space="preserve"> battery plate </w:t>
-      </w:r>
-      <w:r>
-        <w:rPr>
-          <w:rFonts w:ascii="Cambria" w:hAnsi="Cambria" w:cs="Arial"/>
-        </w:rPr>
-        <w:t xml:space="preserve">[A4b] </w:t>
-      </w:r>
-      <w:r>
-        <w:rPr>
-          <w:rFonts w:ascii="Cambria" w:hAnsi="Cambria" w:cs="Arial"/>
-        </w:rPr>
-        <w:t xml:space="preserve">(rectangle with rounded corners) onto the </w:t>
-      </w:r>
-      <w:r>
-        <w:rPr>
-          <w:rFonts w:ascii="Cambria" w:hAnsi="Cambria" w:cs="Arial"/>
-        </w:rPr>
-        <w:t xml:space="preserve">standoffs and </w:t>
-      </w:r>
-      <w:r>
-        <w:rPr>
-          <w:rFonts w:ascii="Cambria" w:hAnsi="Cambria" w:cs="Arial"/>
-        </w:rPr>
-        <w:t xml:space="preserve">attach </w:t>
-      </w:r>
-      <w:r>
-        <w:rPr>
-          <w:rFonts w:ascii="Cambria" w:hAnsi="Cambria" w:cs="Arial"/>
-        </w:rPr>
-        <w:t xml:space="preserve">4x 10mm nylon standoffs </w:t>
-      </w:r>
-      <w:r>
-        <w:rPr>
-          <w:rFonts w:ascii="Cambria" w:hAnsi="Cambria" w:cs="Arial"/>
-        </w:rPr>
-        <w:t>through it into the brass standoffs of the bottom plate</w:t>
-      </w:r>
-      <w:r>
-        <w:rPr>
-          <w:rFonts w:ascii="Cambria" w:hAnsi="Cambria" w:cs="Arial"/>
-        </w:rPr>
-        <w:t xml:space="preserve"> [A1]</w:t>
-      </w:r>
-      <w:r>
-        <w:rPr>
-          <w:rFonts w:ascii="Cambria" w:hAnsi="Cambria" w:cs="Arial"/>
-        </w:rPr>
-        <w:t xml:space="preserve"> to secure it in place</w:t>
-      </w:r>
-      <w:r>
-        <w:rPr>
-          <w:rFonts w:ascii="Cambria" w:hAnsi="Cambria" w:cs="Arial"/>
-        </w:rPr>
-        <w:t>.</w:t>
-      </w:r>
-    </w:p>
-    <w:p>
-      <w:pPr>
-        <w:pStyle w:val="ListParagraph"/>
+        <w:t>Check if the bottom plate is level. Adjust the 3x M3 Locknuts if necessary.</w:t>
+      </w:r>
+      <w:r>
+        <w:rPr>
+          <w:rFonts w:ascii="Cambria" w:hAnsi="Cambria" w:cs="Arial"/>
+        </w:rPr>
+        <w:br/>
+      </w:r>
+      <w:r>
+        <w:rPr>
+          <w:rFonts w:ascii="Cambria" w:hAnsi="Cambria" w:cs="Arial"/>
+          <w:noProof/>
+        </w:rPr>
+        <w:drawing>
+          <wp:inline distT="0" distB="0" distL="0" distR="0" wp14:anchorId="510D9826" wp14:editId="48B703B9">
+            <wp:extent cx="2564445" cy="1400947"/>
+            <wp:effectExtent l="0" t="0" r="1270" b="0"/>
+            <wp:docPr id="1550887517" name="Picture 14" descr="A close-up of a small wheel&#10;&#10;Description automatically generated"/>
+            <wp:cNvGraphicFramePr>
+              <a:graphicFrameLocks xmlns:a="http://schemas.openxmlformats.org/drawingml/2006/main" noChangeAspect="1"/>
+            </wp:cNvGraphicFramePr>
+            <a:graphic xmlns:a="http://schemas.openxmlformats.org/drawingml/2006/main">
+              <a:graphicData uri="http://schemas.openxmlformats.org/drawingml/2006/picture">
+                <pic:pic xmlns:pic="http://schemas.openxmlformats.org/drawingml/2006/picture">
+                  <pic:nvPicPr>
+                    <pic:cNvPr id="1550887517" name="Picture 14" descr="A close-up of a small wheel&#10;&#10;Description automatically generated"/>
+                    <pic:cNvPicPr/>
+                  </pic:nvPicPr>
+                  <pic:blipFill>
+                    <a:blip r:embed="rId43">
+                      <a:extLst>
+                        <a:ext uri="{28A0092B-C50C-407E-A947-70E740481C1C}">
+                          <a14:useLocalDpi xmlns:a14="http://schemas.microsoft.com/office/drawing/2010/main" val="0"/>
+                        </a:ext>
+                      </a:extLst>
+                    </a:blip>
+                    <a:stretch>
+                      <a:fillRect/>
+                    </a:stretch>
+                  </pic:blipFill>
+                  <pic:spPr>
+                    <a:xfrm>
+                      <a:off x="0" y="0"/>
+                      <a:ext cx="2612901" cy="1427418"/>
+                    </a:xfrm>
+                    <a:prstGeom prst="rect">
+                      <a:avLst/>
+                    </a:prstGeom>
+                  </pic:spPr>
+                </pic:pic>
+              </a:graphicData>
+            </a:graphic>
+          </wp:inline>
+        </w:drawing>
+      </w:r>
+    </w:p>
+    <w:p>
+      <w:pPr>
+        <w:jc w:val="center"/>
         <w:rPr>
           <w:rFonts w:ascii="Cambria" w:hAnsi="Cambria" w:cs="Arial"/>
         </w:rPr>
@@ -10268,31 +10674,79 @@
         <w:rPr>
           <w:rFonts w:ascii="Cambria" w:hAnsi="Cambria" w:cs="Arial"/>
         </w:rPr>
-        <w:t>On</w:t>
-      </w:r>
-      <w:r>
-        <w:rPr>
-          <w:rFonts w:ascii="Cambria" w:hAnsi="Cambria" w:cs="Arial"/>
-        </w:rPr>
-        <w:t xml:space="preserve"> top of the bottom battery plate [A4b]</w:t>
-      </w:r>
-      <w:r>
-        <w:rPr>
-          <w:rFonts w:ascii="Cambria" w:hAnsi="Cambria" w:cs="Arial"/>
-        </w:rPr>
-        <w:t>, place the batte</w:t>
-      </w:r>
-      <w:r>
-        <w:rPr>
-          <w:rFonts w:ascii="Cambria" w:hAnsi="Cambria" w:cs="Arial"/>
-        </w:rPr>
-        <w:t>ry</w:t>
-      </w:r>
-      <w:r>
-        <w:rPr>
-          <w:rFonts w:ascii="Cambria" w:hAnsi="Cambria" w:cs="Arial"/>
-        </w:rPr>
-        <w:t xml:space="preserve">. </w:t>
+        <w:t>Place</w:t>
+      </w:r>
+      <w:r>
+        <w:rPr>
+          <w:rFonts w:ascii="Cambria" w:hAnsi="Cambria" w:cs="Arial"/>
+        </w:rPr>
+        <w:t xml:space="preserve"> the</w:t>
+      </w:r>
+      <w:r>
+        <w:rPr>
+          <w:rFonts w:ascii="Cambria" w:hAnsi="Cambria" w:cs="Arial"/>
+        </w:rPr>
+        <w:t xml:space="preserve"> bottom</w:t>
+      </w:r>
+      <w:r>
+        <w:rPr>
+          <w:rFonts w:ascii="Cambria" w:hAnsi="Cambria" w:cs="Arial"/>
+        </w:rPr>
+        <w:t xml:space="preserve"> battery plate </w:t>
+      </w:r>
+      <w:r>
+        <w:rPr>
+          <w:rFonts w:ascii="Cambria" w:hAnsi="Cambria" w:cs="Arial"/>
+        </w:rPr>
+        <w:t xml:space="preserve">[A4b] </w:t>
+      </w:r>
+      <w:r>
+        <w:rPr>
+          <w:rFonts w:ascii="Cambria" w:hAnsi="Cambria" w:cs="Arial"/>
+        </w:rPr>
+        <w:t xml:space="preserve">(rectangle with rounded corners) onto the </w:t>
+      </w:r>
+      <w:r>
+        <w:rPr>
+          <w:rFonts w:ascii="Cambria" w:hAnsi="Cambria" w:cs="Arial"/>
+        </w:rPr>
+        <w:t xml:space="preserve">standoffs and </w:t>
+      </w:r>
+      <w:r>
+        <w:rPr>
+          <w:rFonts w:ascii="Cambria" w:hAnsi="Cambria" w:cs="Arial"/>
+        </w:rPr>
+        <w:t xml:space="preserve">attach </w:t>
+      </w:r>
+      <w:r>
+        <w:rPr>
+          <w:rFonts w:ascii="Cambria" w:hAnsi="Cambria" w:cs="Arial"/>
+        </w:rPr>
+        <w:t xml:space="preserve">4x 10mm nylon standoffs </w:t>
+      </w:r>
+      <w:r>
+        <w:rPr>
+          <w:rFonts w:ascii="Cambria" w:hAnsi="Cambria" w:cs="Arial"/>
+        </w:rPr>
+        <w:t>through it into the brass standoffs of the bottom plate</w:t>
+      </w:r>
+      <w:r>
+        <w:rPr>
+          <w:rFonts w:ascii="Cambria" w:hAnsi="Cambria" w:cs="Arial"/>
+        </w:rPr>
+        <w:t xml:space="preserve"> [A1]</w:t>
+      </w:r>
+      <w:r>
+        <w:rPr>
+          <w:rFonts w:ascii="Cambria" w:hAnsi="Cambria" w:cs="Arial"/>
+        </w:rPr>
+        <w:t xml:space="preserve"> to secure it in place</w:t>
+      </w:r>
+      <w:r>
+        <w:rPr>
+          <w:rFonts w:ascii="Cambria" w:hAnsi="Cambria" w:cs="Arial"/>
+        </w:rPr>
+        <w:t>.</w:t>
       </w:r>
     </w:p>
     <w:p>
@@ -10318,55 +10772,31 @@
         <w:rPr>
           <w:rFonts w:ascii="Cambria" w:hAnsi="Cambria" w:cs="Arial"/>
         </w:rPr>
-        <w:t xml:space="preserve">With the top </w:t>
-      </w:r>
-      <w:r>
-        <w:rPr>
-          <w:rFonts w:ascii="Cambria" w:hAnsi="Cambria" w:cs="Arial"/>
-        </w:rPr>
-        <w:t xml:space="preserve">battery plate [A4t] close, take the </w:t>
-      </w:r>
-      <w:r>
-        <w:rPr>
-          <w:rFonts w:ascii="Cambria" w:hAnsi="Cambria" w:cs="Arial"/>
-        </w:rPr>
-        <w:t>battery wires and place them under the plate</w:t>
-      </w:r>
-      <w:r>
-        <w:rPr>
-          <w:rFonts w:ascii="Cambria" w:hAnsi="Cambria" w:cs="Arial"/>
-        </w:rPr>
-        <w:t xml:space="preserve"> [A4t]</w:t>
-      </w:r>
-      <w:r>
-        <w:rPr>
-          <w:rFonts w:ascii="Cambria" w:hAnsi="Cambria" w:cs="Arial"/>
-        </w:rPr>
-        <w:t xml:space="preserve"> in a way that will hold them and leaves about </w:t>
-      </w:r>
-      <w:r>
-        <w:rPr>
-          <w:rFonts w:ascii="Cambria" w:hAnsi="Cambria" w:cs="Arial"/>
-        </w:rPr>
-        <w:t>2cm</w:t>
-      </w:r>
-      <w:r>
-        <w:rPr>
-          <w:rFonts w:ascii="Cambria" w:hAnsi="Cambria" w:cs="Arial"/>
-        </w:rPr>
-        <w:t xml:space="preserve"> </w:t>
-      </w:r>
-      <w:r>
-        <w:rPr>
-          <w:rFonts w:ascii="Cambria" w:hAnsi="Cambria" w:cs="Arial"/>
-        </w:rPr>
-        <w:t xml:space="preserve">of wire </w:t>
-      </w:r>
-      <w:r>
-        <w:rPr>
-          <w:rFonts w:ascii="Cambria" w:hAnsi="Cambria" w:cs="Arial"/>
-        </w:rPr>
-        <w:t>free.</w:t>
+        <w:t>On</w:t>
+      </w:r>
+      <w:r>
+        <w:rPr>
+          <w:rFonts w:ascii="Cambria" w:hAnsi="Cambria" w:cs="Arial"/>
+        </w:rPr>
+        <w:t xml:space="preserve"> top of the bottom battery plate [A4b]</w:t>
+      </w:r>
+      <w:r>
+        <w:rPr>
+          <w:rFonts w:ascii="Cambria" w:hAnsi="Cambria" w:cs="Arial"/>
+        </w:rPr>
+        <w:t>, place the batte</w:t>
+      </w:r>
+      <w:r>
+        <w:rPr>
+          <w:rFonts w:ascii="Cambria" w:hAnsi="Cambria" w:cs="Arial"/>
+        </w:rPr>
+        <w:t>ry</w:t>
+      </w:r>
+      <w:r>
+        <w:rPr>
+          <w:rFonts w:ascii="Cambria" w:hAnsi="Cambria" w:cs="Arial"/>
+        </w:rPr>
+        <w:t xml:space="preserve">. </w:t>
       </w:r>
     </w:p>
     <w:p>
@@ -10392,25 +10822,37 @@
         <w:rPr>
           <w:rFonts w:ascii="Cambria" w:hAnsi="Cambria" w:cs="Arial"/>
         </w:rPr>
-        <w:t xml:space="preserve">Press the top battery plate </w:t>
-      </w:r>
-      <w:r>
-        <w:rPr>
-          <w:rFonts w:ascii="Cambria" w:hAnsi="Cambria" w:cs="Arial"/>
-        </w:rPr>
-        <w:t xml:space="preserve">[A4t] </w:t>
-      </w:r>
-      <w:r>
-        <w:rPr>
-          <w:rFonts w:ascii="Cambria" w:hAnsi="Cambria" w:cs="Arial"/>
-        </w:rPr>
-        <w:t xml:space="preserve">down and attach 4x </w:t>
-      </w:r>
-      <w:r>
-        <w:rPr>
-          <w:rFonts w:ascii="Cambria" w:hAnsi="Cambria" w:cs="Arial"/>
-        </w:rPr>
-        <w:t>6mm</w:t>
+        <w:t xml:space="preserve">With the top </w:t>
+      </w:r>
+      <w:r>
+        <w:rPr>
+          <w:rFonts w:ascii="Cambria" w:hAnsi="Cambria" w:cs="Arial"/>
+        </w:rPr>
+        <w:t xml:space="preserve">battery plate [A4t] close, take the </w:t>
+      </w:r>
+      <w:r>
+        <w:rPr>
+          <w:rFonts w:ascii="Cambria" w:hAnsi="Cambria" w:cs="Arial"/>
+        </w:rPr>
+        <w:t>battery wires and place them under the plate</w:t>
+      </w:r>
+      <w:r>
+        <w:rPr>
+          <w:rFonts w:ascii="Cambria" w:hAnsi="Cambria" w:cs="Arial"/>
+        </w:rPr>
+        <w:t xml:space="preserve"> [A4t]</w:t>
+      </w:r>
+      <w:r>
+        <w:rPr>
+          <w:rFonts w:ascii="Cambria" w:hAnsi="Cambria" w:cs="Arial"/>
+        </w:rPr>
+        <w:t xml:space="preserve"> in a way that will hold them and leaves about </w:t>
+      </w:r>
+      <w:r>
+        <w:rPr>
+          <w:rFonts w:ascii="Cambria" w:hAnsi="Cambria" w:cs="Arial"/>
+        </w:rPr>
+        <w:t>2cm</w:t>
       </w:r>
       <w:r>
         <w:rPr>
@@ -10422,13 +10864,13 @@
         <w:rPr>
           <w:rFonts w:ascii="Cambria" w:hAnsi="Cambria" w:cs="Arial"/>
         </w:rPr>
-        <w:t xml:space="preserve">nylon standoffs </w:t>
-      </w:r>
-      <w:r>
-        <w:rPr>
-          <w:rFonts w:ascii="Cambria" w:hAnsi="Cambria" w:cs="Arial"/>
-        </w:rPr>
-        <w:t>to secure it in place.</w:t>
+        <w:t xml:space="preserve">of wire </w:t>
+      </w:r>
+      <w:r>
+        <w:rPr>
+          <w:rFonts w:ascii="Cambria" w:hAnsi="Cambria" w:cs="Arial"/>
+        </w:rPr>
+        <w:t>free.</w:t>
       </w:r>
     </w:p>
     <w:p>
@@ -10436,7 +10878,6 @@
         <w:pStyle w:val="ListParagraph"/>
         <w:rPr>
           <w:rFonts w:ascii="Cambria" w:hAnsi="Cambria" w:cs="Arial"/>
-          <w:color w:val="FF0000"/>
         </w:rPr>
       </w:pPr>
     </w:p>
@@ -10449,6 +10890,69 @@
         </w:numPr>
         <w:rPr>
           <w:rFonts w:ascii="Cambria" w:hAnsi="Cambria" w:cs="Arial"/>
+        </w:rPr>
+      </w:pPr>
+      <w:r>
+        <w:rPr>
+          <w:rFonts w:ascii="Cambria" w:hAnsi="Cambria" w:cs="Arial"/>
+        </w:rPr>
+        <w:t xml:space="preserve">Press the top battery plate </w:t>
+      </w:r>
+      <w:r>
+        <w:rPr>
+          <w:rFonts w:ascii="Cambria" w:hAnsi="Cambria" w:cs="Arial"/>
+        </w:rPr>
+        <w:t xml:space="preserve">[A4t] </w:t>
+      </w:r>
+      <w:r>
+        <w:rPr>
+          <w:rFonts w:ascii="Cambria" w:hAnsi="Cambria" w:cs="Arial"/>
+        </w:rPr>
+        <w:t xml:space="preserve">down and attach 4x </w:t>
+      </w:r>
+      <w:r>
+        <w:rPr>
+          <w:rFonts w:ascii="Cambria" w:hAnsi="Cambria" w:cs="Arial"/>
+        </w:rPr>
+        <w:t>6mm</w:t>
+      </w:r>
+      <w:r>
+        <w:rPr>
+          <w:rFonts w:ascii="Cambria" w:hAnsi="Cambria" w:cs="Arial"/>
+        </w:rPr>
+        <w:t xml:space="preserve"> </w:t>
+      </w:r>
+      <w:r>
+        <w:rPr>
+          <w:rFonts w:ascii="Cambria" w:hAnsi="Cambria" w:cs="Arial"/>
+        </w:rPr>
+        <w:t xml:space="preserve">nylon standoffs </w:t>
+      </w:r>
+      <w:r>
+        <w:rPr>
+          <w:rFonts w:ascii="Cambria" w:hAnsi="Cambria" w:cs="Arial"/>
+        </w:rPr>
+        <w:t>to secure it in place.</w:t>
+      </w:r>
+    </w:p>
+    <w:p>
+      <w:pPr>
+        <w:pStyle w:val="ListParagraph"/>
+        <w:rPr>
+          <w:rFonts w:ascii="Cambria" w:hAnsi="Cambria" w:cs="Arial"/>
+          <w:color w:val="FF0000"/>
+        </w:rPr>
+      </w:pPr>
+    </w:p>
+    <w:p>
+      <w:pPr>
+        <w:pStyle w:val="ListParagraph"/>
+        <w:numPr>
+          <w:ilvl w:val="0"/>
+          <w:numId w:val="2"/>
+        </w:numPr>
+        <w:rPr>
+          <w:rFonts w:ascii="Cambria" w:hAnsi="Cambria" w:cs="Arial"/>
           <w:color w:val="000000" w:themeColor="text1"/>
         </w:rPr>
       </w:pPr>
@@ -10504,6 +11008,7 @@
           <w:rFonts w:ascii="Cambria" w:hAnsi="Cambria" w:cs="Arial"/>
           <w:color w:val="000000" w:themeColor="text1"/>
         </w:rPr>
+        <w:lastRenderedPageBreak/>
         <w:t>B</w:t>
       </w:r>
       <w:r>
@@ -10613,17 +11118,8 @@
           <w:rFonts w:ascii="Cambria" w:hAnsi="Cambria" w:cs="Arial"/>
           <w:color w:val="000000" w:themeColor="text1"/>
         </w:rPr>
-        <w:t xml:space="preserve">lug the motor connectors into their corresponding </w:t>
-      </w:r>
-      <w:proofErr w:type="gramStart"/>
-      <w:r>
-        <w:rPr>
-          <w:rFonts w:ascii="Cambria" w:hAnsi="Cambria" w:cs="Arial"/>
-          <w:color w:val="000000" w:themeColor="text1"/>
-        </w:rPr>
-        <w:t>motor</w:t>
-      </w:r>
-      <w:proofErr w:type="gramEnd"/>
+        <w:t>lug the motor connectors into their corresponding motor</w:t>
+      </w:r>
     </w:p>
     <w:p>
       <w:pPr>
@@ -10734,16 +11230,8 @@
         <w:rPr>
           <w:rFonts w:ascii="Cambria" w:hAnsi="Cambria" w:cs="Arial"/>
         </w:rPr>
-        <w:t xml:space="preserve">connector on the </w:t>
-      </w:r>
-      <w:proofErr w:type="gramStart"/>
-      <w:r>
-        <w:rPr>
-          <w:rFonts w:ascii="Cambria" w:hAnsi="Cambria" w:cs="Arial"/>
-        </w:rPr>
-        <w:t>PCB</w:t>
-      </w:r>
-      <w:proofErr w:type="gramEnd"/>
+        <w:t>connector on the PCB</w:t>
+      </w:r>
     </w:p>
     <w:p>
       <w:pPr>
@@ -10856,7 +11344,6 @@
         <w:rPr>
           <w:rFonts w:ascii="Cambria" w:hAnsi="Cambria" w:cs="Arial"/>
         </w:rPr>
-        <w:lastRenderedPageBreak/>
         <w:t xml:space="preserve">Thread the four wires through the slot on the </w:t>
       </w:r>
       <w:r>
@@ -11005,16 +11492,8 @@
         <w:rPr>
           <w:rFonts w:ascii="Cambria" w:hAnsi="Cambria" w:cs="Arial"/>
         </w:rPr>
-        <w:t xml:space="preserve">screws used for the tracking balls into the top </w:t>
-      </w:r>
-      <w:proofErr w:type="gramStart"/>
-      <w:r>
-        <w:rPr>
-          <w:rFonts w:ascii="Cambria" w:hAnsi="Cambria" w:cs="Arial"/>
-        </w:rPr>
-        <w:t>plate</w:t>
-      </w:r>
-      <w:proofErr w:type="gramEnd"/>
+        <w:t>screws used for the tracking balls into the top plate</w:t>
+      </w:r>
     </w:p>
     <w:p>
       <w:pPr>
@@ -11200,16 +11679,8 @@
         <w:rPr>
           <w:rFonts w:ascii="Cambria" w:hAnsi="Cambria" w:cs="Arial"/>
         </w:rPr>
-        <w:t xml:space="preserve">into the </w:t>
-      </w:r>
-      <w:proofErr w:type="gramStart"/>
-      <w:r>
-        <w:rPr>
-          <w:rFonts w:ascii="Cambria" w:hAnsi="Cambria" w:cs="Arial"/>
-        </w:rPr>
-        <w:t>grooves</w:t>
-      </w:r>
-      <w:proofErr w:type="gramEnd"/>
+        <w:t>into the grooves</w:t>
+      </w:r>
     </w:p>
     <w:p>
       <w:pPr>
@@ -11240,16 +11711,8 @@
         <w:rPr>
           <w:rFonts w:ascii="Cambria" w:hAnsi="Cambria" w:cs="Arial"/>
         </w:rPr>
-        <w:t xml:space="preserve"> port on the side of the </w:t>
-      </w:r>
-      <w:proofErr w:type="gramStart"/>
-      <w:r>
-        <w:rPr>
-          <w:rFonts w:ascii="Cambria" w:hAnsi="Cambria" w:cs="Arial"/>
-        </w:rPr>
-        <w:t>PCB</w:t>
-      </w:r>
-      <w:proofErr w:type="gramEnd"/>
+        <w:t xml:space="preserve"> port on the side of the PCB</w:t>
+      </w:r>
     </w:p>
     <w:p>
       <w:pPr>
@@ -11471,7 +11934,7 @@
         </w:rPr>
         <w:t xml:space="preserve">This will require the Gritsbot3/Library folder to be placed in your Arduino libraries and the Arduino IDE set up to work with Teensy 4.0 which can be done following </w:t>
       </w:r>
-      <w:hyperlink r:id="rId35" w:history="1">
+      <w:hyperlink r:id="rId44" w:history="1">
         <w:r>
           <w:rPr>
             <w:rStyle w:val="Hyperlink"/>
@@ -11732,16 +12195,8 @@
         <w:rPr>
           <w:rFonts w:ascii="Cambria" w:hAnsi="Cambria" w:cs="Arial"/>
         </w:rPr>
-        <w:t xml:space="preserve"> for cutting power to the Pi for charging </w:t>
-      </w:r>
-      <w:proofErr w:type="gramStart"/>
-      <w:r>
-        <w:rPr>
-          <w:rFonts w:ascii="Cambria" w:hAnsi="Cambria" w:cs="Arial"/>
-        </w:rPr>
-        <w:t>timeouts</w:t>
-      </w:r>
-      <w:proofErr w:type="gramEnd"/>
+        <w:t xml:space="preserve"> for cutting power to the Pi for charging timeouts</w:t>
+      </w:r>
     </w:p>
     <w:p>
       <w:pPr>
@@ -11853,7 +12308,7 @@
         </w:rPr>
         <w:t xml:space="preserve">BOM: </w:t>
       </w:r>
-      <w:hyperlink r:id="rId36" w:history="1">
+      <w:hyperlink r:id="rId45" w:history="1">
         <w:r>
           <w:rPr>
             <w:rStyle w:val="Hyperlink"/>
@@ -11912,7 +12367,7 @@
         </w:rPr>
         <w:t xml:space="preserve">: </w:t>
       </w:r>
-      <w:hyperlink r:id="rId37" w:history="1">
+      <w:hyperlink r:id="rId46" w:history="1">
         <w:r>
           <w:rPr>
             <w:rStyle w:val="Hyperlink"/>
@@ -11941,7 +12396,7 @@
         </w:rPr>
         <w:t xml:space="preserve"> 2.0 Hardware: </w:t>
       </w:r>
-      <w:hyperlink r:id="rId38" w:history="1">
+      <w:hyperlink r:id="rId47" w:history="1">
         <w:r>
           <w:rPr>
             <w:rStyle w:val="Hyperlink"/>
@@ -12001,7 +12456,7 @@
         </w:rPr>
         <w:t xml:space="preserve"> at Georgia Tech: </w:t>
       </w:r>
-      <w:hyperlink r:id="rId39" w:history="1">
+      <w:hyperlink r:id="rId48" w:history="1">
         <w:r>
           <w:rPr>
             <w:rStyle w:val="Hyperlink"/>
@@ -12019,7 +12474,7 @@
       </w:pPr>
     </w:p>
     <w:sectPr>
-      <w:footerReference w:type="default" r:id="rId40"/>
+      <w:footerReference w:type="default" r:id="rId49"/>
       <w:pgSz w:w="12240" w:h="15840"/>
       <w:pgMar w:top="1440" w:right="1440" w:bottom="1440" w:left="1440" w:header="720" w:footer="720" w:gutter="0"/>
       <w:cols w:space="720"/>
@@ -12031,7 +12486,7 @@
 </file>
 
 <file path=word/endnotes.xml><?xml version="1.0" encoding="utf-8"?>
-<w:endnotes xmlns:wpc="http://schemas.microsoft.com/office/word/2010/wordprocessingCanvas" xmlns:cx="http://schemas.microsoft.com/office/drawing/2014/chartex" xmlns:cx1="http://schemas.microsoft.com/office/drawing/2015/9/8/chartex" xmlns:cx2="http://schemas.microsoft.com/office/drawing/2015/10/21/chartex" xmlns:cx3="http://schemas.microsoft.com/office/drawing/2016/5/9/chartex" xmlns:cx4="http://schemas.microsoft.com/office/drawing/2016/5/10/chartex" xmlns:cx5="http://schemas.microsoft.com/office/drawing/2016/5/11/chartex" xmlns:cx6="http://schemas.microsoft.com/office/drawing/2016/5/12/chartex" xmlns:cx7="http://schemas.microsoft.com/office/drawing/2016/5/13/chartex" xmlns:cx8="http://schemas.microsoft.com/office/drawing/2016/5/14/chartex" xmlns:mc="http://schemas.openxmlformats.org/markup-compatibility/2006" xmlns:aink="http://schemas.microsoft.com/office/drawing/2016/ink" xmlns:am3d="http://schemas.microsoft.com/office/drawing/2017/model3d" xmlns:o="urn:schemas-microsoft-com:office:office" xmlns:oel="http://schemas.microsoft.com/office/2019/extlst" xmlns:r="http://schemas.openxmlformats.org/officeDocument/2006/relationships" xmlns:m="http://schemas.openxmlformats.org/officeDocument/2006/math" xmlns:v="urn:schemas-microsoft-com:vml" xmlns:wp14="http://schemas.microsoft.com/office/word/2010/wordprocessingDrawing" xmlns:wp="http://schemas.openxmlformats.org/drawingml/2006/wordprocessingDrawing" xmlns:w10="urn:schemas-microsoft-com:office:word" xmlns:w="http://schemas.openxmlformats.org/wordprocessingml/2006/main" xmlns:w14="http://schemas.microsoft.com/office/word/2010/wordml" xmlns:w15="http://schemas.microsoft.com/office/word/2012/wordml" xmlns:w16cex="http://schemas.microsoft.com/office/word/2018/wordml/cex" xmlns:w16cid="http://schemas.microsoft.com/office/word/2016/wordml/cid" xmlns:w16="http://schemas.microsoft.com/office/word/2018/wordml" xmlns:w16sdtdh="http://schemas.microsoft.com/office/word/2020/wordml/sdtdatahash" xmlns:w16se="http://schemas.microsoft.com/office/word/2015/wordml/symex" xmlns:wpg="http://schemas.microsoft.com/office/word/2010/wordprocessingGroup" xmlns:wpi="http://schemas.microsoft.com/office/word/2010/wordprocessingInk" xmlns:wne="http://schemas.microsoft.com/office/word/2006/wordml" xmlns:wps="http://schemas.microsoft.com/office/word/2010/wordprocessingShape" mc:Ignorable="w14 w15 w16se w16cid w16 w16cex w16sdtdh wp14">
+<w:endnotes xmlns:wpc="http://schemas.microsoft.com/office/word/2010/wordprocessingCanvas" xmlns:cx="http://schemas.microsoft.com/office/drawing/2014/chartex" xmlns:cx1="http://schemas.microsoft.com/office/drawing/2015/9/8/chartex" xmlns:cx2="http://schemas.microsoft.com/office/drawing/2015/10/21/chartex" xmlns:cx3="http://schemas.microsoft.com/office/drawing/2016/5/9/chartex" xmlns:cx4="http://schemas.microsoft.com/office/drawing/2016/5/10/chartex" xmlns:cx5="http://schemas.microsoft.com/office/drawing/2016/5/11/chartex" xmlns:cx6="http://schemas.microsoft.com/office/drawing/2016/5/12/chartex" xmlns:cx7="http://schemas.microsoft.com/office/drawing/2016/5/13/chartex" xmlns:cx8="http://schemas.microsoft.com/office/drawing/2016/5/14/chartex" xmlns:mc="http://schemas.openxmlformats.org/markup-compatibility/2006" xmlns:aink="http://schemas.microsoft.com/office/drawing/2016/ink" xmlns:am3d="http://schemas.microsoft.com/office/drawing/2017/model3d" xmlns:o="urn:schemas-microsoft-com:office:office" xmlns:oel="http://schemas.microsoft.com/office/2019/extlst" xmlns:r="http://schemas.openxmlformats.org/officeDocument/2006/relationships" xmlns:m="http://schemas.openxmlformats.org/officeDocument/2006/math" xmlns:v="urn:schemas-microsoft-com:vml" xmlns:wp14="http://schemas.microsoft.com/office/word/2010/wordprocessingDrawing" xmlns:wp="http://schemas.openxmlformats.org/drawingml/2006/wordprocessingDrawing" xmlns:w10="urn:schemas-microsoft-com:office:word" xmlns:w="http://schemas.openxmlformats.org/wordprocessingml/2006/main" xmlns:w14="http://schemas.microsoft.com/office/word/2010/wordml" xmlns:w15="http://schemas.microsoft.com/office/word/2012/wordml" xmlns:w16cex="http://schemas.microsoft.com/office/word/2018/wordml/cex" xmlns:w16cid="http://schemas.microsoft.com/office/word/2016/wordml/cid" xmlns:w16="http://schemas.microsoft.com/office/word/2018/wordml" xmlns:w16du="http://schemas.microsoft.com/office/word/2023/wordml/word16du" xmlns:w16sdtdh="http://schemas.microsoft.com/office/word/2020/wordml/sdtdatahash" xmlns:w16se="http://schemas.microsoft.com/office/word/2015/wordml/symex" xmlns:wpg="http://schemas.microsoft.com/office/word/2010/wordprocessingGroup" xmlns:wpi="http://schemas.microsoft.com/office/word/2010/wordprocessingInk" xmlns:wne="http://schemas.microsoft.com/office/word/2006/wordml" xmlns:wps="http://schemas.microsoft.com/office/word/2010/wordprocessingShape" mc:Ignorable="w14 w15 w16se w16cid w16 w16cex w16sdtdh w16du wp14">
   <w:endnote w:type="separator" w:id="-1">
     <w:p>
       <w:pPr>
@@ -12063,7 +12518,7 @@
 </file>
 
 <file path=word/footer1.xml><?xml version="1.0" encoding="utf-8"?>
-<w:ftr xmlns:wpc="http://schemas.microsoft.com/office/word/2010/wordprocessingCanvas" xmlns:cx="http://schemas.microsoft.com/office/drawing/2014/chartex" xmlns:cx1="http://schemas.microsoft.com/office/drawing/2015/9/8/chartex" xmlns:cx2="http://schemas.microsoft.com/office/drawing/2015/10/21/chartex" xmlns:cx3="http://schemas.microsoft.com/office/drawing/2016/5/9/chartex" xmlns:cx4="http://schemas.microsoft.com/office/drawing/2016/5/10/chartex" xmlns:cx5="http://schemas.microsoft.com/office/drawing/2016/5/11/chartex" xmlns:cx6="http://schemas.microsoft.com/office/drawing/2016/5/12/chartex" xmlns:cx7="http://schemas.microsoft.com/office/drawing/2016/5/13/chartex" xmlns:cx8="http://schemas.microsoft.com/office/drawing/2016/5/14/chartex" xmlns:mc="http://schemas.openxmlformats.org/markup-compatibility/2006" xmlns:aink="http://schemas.microsoft.com/office/drawing/2016/ink" xmlns:am3d="http://schemas.microsoft.com/office/drawing/2017/model3d" xmlns:o="urn:schemas-microsoft-com:office:office" xmlns:oel="http://schemas.microsoft.com/office/2019/extlst" xmlns:r="http://schemas.openxmlformats.org/officeDocument/2006/relationships" xmlns:m="http://schemas.openxmlformats.org/officeDocument/2006/math" xmlns:v="urn:schemas-microsoft-com:vml" xmlns:wp14="http://schemas.microsoft.com/office/word/2010/wordprocessingDrawing" xmlns:wp="http://schemas.openxmlformats.org/drawingml/2006/wordprocessingDrawing" xmlns:w10="urn:schemas-microsoft-com:office:word" xmlns:w="http://schemas.openxmlformats.org/wordprocessingml/2006/main" xmlns:w14="http://schemas.microsoft.com/office/word/2010/wordml" xmlns:w15="http://schemas.microsoft.com/office/word/2012/wordml" xmlns:w16cex="http://schemas.microsoft.com/office/word/2018/wordml/cex" xmlns:w16cid="http://schemas.microsoft.com/office/word/2016/wordml/cid" xmlns:w16="http://schemas.microsoft.com/office/word/2018/wordml" xmlns:w16sdtdh="http://schemas.microsoft.com/office/word/2020/wordml/sdtdatahash" xmlns:w16se="http://schemas.microsoft.com/office/word/2015/wordml/symex" xmlns:wpg="http://schemas.microsoft.com/office/word/2010/wordprocessingGroup" xmlns:wpi="http://schemas.microsoft.com/office/word/2010/wordprocessingInk" xmlns:wne="http://schemas.microsoft.com/office/word/2006/wordml" xmlns:wps="http://schemas.microsoft.com/office/word/2010/wordprocessingShape" mc:Ignorable="w14 w15 w16se w16cid w16 w16cex w16sdtdh wp14">
+<w:ftr xmlns:wpc="http://schemas.microsoft.com/office/word/2010/wordprocessingCanvas" xmlns:cx="http://schemas.microsoft.com/office/drawing/2014/chartex" xmlns:cx1="http://schemas.microsoft.com/office/drawing/2015/9/8/chartex" xmlns:cx2="http://schemas.microsoft.com/office/drawing/2015/10/21/chartex" xmlns:cx3="http://schemas.microsoft.com/office/drawing/2016/5/9/chartex" xmlns:cx4="http://schemas.microsoft.com/office/drawing/2016/5/10/chartex" xmlns:cx5="http://schemas.microsoft.com/office/drawing/2016/5/11/chartex" xmlns:cx6="http://schemas.microsoft.com/office/drawing/2016/5/12/chartex" xmlns:cx7="http://schemas.microsoft.com/office/drawing/2016/5/13/chartex" xmlns:cx8="http://schemas.microsoft.com/office/drawing/2016/5/14/chartex" xmlns:mc="http://schemas.openxmlformats.org/markup-compatibility/2006" xmlns:aink="http://schemas.microsoft.com/office/drawing/2016/ink" xmlns:am3d="http://schemas.microsoft.com/office/drawing/2017/model3d" xmlns:o="urn:schemas-microsoft-com:office:office" xmlns:oel="http://schemas.microsoft.com/office/2019/extlst" xmlns:r="http://schemas.openxmlformats.org/officeDocument/2006/relationships" xmlns:m="http://schemas.openxmlformats.org/officeDocument/2006/math" xmlns:v="urn:schemas-microsoft-com:vml" xmlns:wp14="http://schemas.microsoft.com/office/word/2010/wordprocessingDrawing" xmlns:wp="http://schemas.openxmlformats.org/drawingml/2006/wordprocessingDrawing" xmlns:w10="urn:schemas-microsoft-com:office:word" xmlns:w="http://schemas.openxmlformats.org/wordprocessingml/2006/main" xmlns:w14="http://schemas.microsoft.com/office/word/2010/wordml" xmlns:w15="http://schemas.microsoft.com/office/word/2012/wordml" xmlns:w16cex="http://schemas.microsoft.com/office/word/2018/wordml/cex" xmlns:w16cid="http://schemas.microsoft.com/office/word/2016/wordml/cid" xmlns:w16="http://schemas.microsoft.com/office/word/2018/wordml" xmlns:w16du="http://schemas.microsoft.com/office/word/2023/wordml/word16du" xmlns:w16sdtdh="http://schemas.microsoft.com/office/word/2020/wordml/sdtdatahash" xmlns:w16se="http://schemas.microsoft.com/office/word/2015/wordml/symex" xmlns:wpg="http://schemas.microsoft.com/office/word/2010/wordprocessingGroup" xmlns:wpi="http://schemas.microsoft.com/office/word/2010/wordprocessingInk" xmlns:wne="http://schemas.microsoft.com/office/word/2006/wordml" xmlns:wps="http://schemas.microsoft.com/office/word/2010/wordprocessingShape" mc:Ignorable="w14 w15 w16se w16cid w16 w16cex w16sdtdh w16du wp14">
   <w:sdt>
     <w:sdtPr>
       <w:id w:val="-1809005032"/>
@@ -12131,7 +12586,7 @@
 </file>
 
 <file path=word/footnotes.xml><?xml version="1.0" encoding="utf-8"?>
-<w:footnotes xmlns:wpc="http://schemas.microsoft.com/office/word/2010/wordprocessingCanvas" xmlns:cx="http://schemas.microsoft.com/office/drawing/2014/chartex" xmlns:cx1="http://schemas.microsoft.com/office/drawing/2015/9/8/chartex" xmlns:cx2="http://schemas.microsoft.com/office/drawing/2015/10/21/chartex" xmlns:cx3="http://schemas.microsoft.com/office/drawing/2016/5/9/chartex" xmlns:cx4="http://schemas.microsoft.com/office/drawing/2016/5/10/chartex" xmlns:cx5="http://schemas.microsoft.com/office/drawing/2016/5/11/chartex" xmlns:cx6="http://schemas.microsoft.com/office/drawing/2016/5/12/chartex" xmlns:cx7="http://schemas.microsoft.com/office/drawing/2016/5/13/chartex" xmlns:cx8="http://schemas.microsoft.com/office/drawing/2016/5/14/chartex" xmlns:mc="http://schemas.openxmlformats.org/markup-compatibility/2006" xmlns:aink="http://schemas.microsoft.com/office/drawing/2016/ink" xmlns:am3d="http://schemas.microsoft.com/office/drawing/2017/model3d" xmlns:o="urn:schemas-microsoft-com:office:office" xmlns:oel="http://schemas.microsoft.com/office/2019/extlst" xmlns:r="http://schemas.openxmlformats.org/officeDocument/2006/relationships" xmlns:m="http://schemas.openxmlformats.org/officeDocument/2006/math" xmlns:v="urn:schemas-microsoft-com:vml" xmlns:wp14="http://schemas.microsoft.com/office/word/2010/wordprocessingDrawing" xmlns:wp="http://schemas.openxmlformats.org/drawingml/2006/wordprocessingDrawing" xmlns:w10="urn:schemas-microsoft-com:office:word" xmlns:w="http://schemas.openxmlformats.org/wordprocessingml/2006/main" xmlns:w14="http://schemas.microsoft.com/office/word/2010/wordml" xmlns:w15="http://schemas.microsoft.com/office/word/2012/wordml" xmlns:w16cex="http://schemas.microsoft.com/office/word/2018/wordml/cex" xmlns:w16cid="http://schemas.microsoft.com/office/word/2016/wordml/cid" xmlns:w16="http://schemas.microsoft.com/office/word/2018/wordml" xmlns:w16sdtdh="http://schemas.microsoft.com/office/word/2020/wordml/sdtdatahash" xmlns:w16se="http://schemas.microsoft.com/office/word/2015/wordml/symex" xmlns:wpg="http://schemas.microsoft.com/office/word/2010/wordprocessingGroup" xmlns:wpi="http://schemas.microsoft.com/office/word/2010/wordprocessingInk" xmlns:wne="http://schemas.microsoft.com/office/word/2006/wordml" xmlns:wps="http://schemas.microsoft.com/office/word/2010/wordprocessingShape" mc:Ignorable="w14 w15 w16se w16cid w16 w16cex w16sdtdh wp14">
+<w:footnotes xmlns:wpc="http://schemas.microsoft.com/office/word/2010/wordprocessingCanvas" xmlns:cx="http://schemas.microsoft.com/office/drawing/2014/chartex" xmlns:cx1="http://schemas.microsoft.com/office/drawing/2015/9/8/chartex" xmlns:cx2="http://schemas.microsoft.com/office/drawing/2015/10/21/chartex" xmlns:cx3="http://schemas.microsoft.com/office/drawing/2016/5/9/chartex" xmlns:cx4="http://schemas.microsoft.com/office/drawing/2016/5/10/chartex" xmlns:cx5="http://schemas.microsoft.com/office/drawing/2016/5/11/chartex" xmlns:cx6="http://schemas.microsoft.com/office/drawing/2016/5/12/chartex" xmlns:cx7="http://schemas.microsoft.com/office/drawing/2016/5/13/chartex" xmlns:cx8="http://schemas.microsoft.com/office/drawing/2016/5/14/chartex" xmlns:mc="http://schemas.openxmlformats.org/markup-compatibility/2006" xmlns:aink="http://schemas.microsoft.com/office/drawing/2016/ink" xmlns:am3d="http://schemas.microsoft.com/office/drawing/2017/model3d" xmlns:o="urn:schemas-microsoft-com:office:office" xmlns:oel="http://schemas.microsoft.com/office/2019/extlst" xmlns:r="http://schemas.openxmlformats.org/officeDocument/2006/relationships" xmlns:m="http://schemas.openxmlformats.org/officeDocument/2006/math" xmlns:v="urn:schemas-microsoft-com:vml" xmlns:wp14="http://schemas.microsoft.com/office/word/2010/wordprocessingDrawing" xmlns:wp="http://schemas.openxmlformats.org/drawingml/2006/wordprocessingDrawing" xmlns:w10="urn:schemas-microsoft-com:office:word" xmlns:w="http://schemas.openxmlformats.org/wordprocessingml/2006/main" xmlns:w14="http://schemas.microsoft.com/office/word/2010/wordml" xmlns:w15="http://schemas.microsoft.com/office/word/2012/wordml" xmlns:w16cex="http://schemas.microsoft.com/office/word/2018/wordml/cex" xmlns:w16cid="http://schemas.microsoft.com/office/word/2016/wordml/cid" xmlns:w16="http://schemas.microsoft.com/office/word/2018/wordml" xmlns:w16du="http://schemas.microsoft.com/office/word/2023/wordml/word16du" xmlns:w16sdtdh="http://schemas.microsoft.com/office/word/2020/wordml/sdtdatahash" xmlns:w16se="http://schemas.microsoft.com/office/word/2015/wordml/symex" xmlns:wpg="http://schemas.microsoft.com/office/word/2010/wordprocessingGroup" xmlns:wpi="http://schemas.microsoft.com/office/word/2010/wordprocessingInk" xmlns:wne="http://schemas.microsoft.com/office/word/2006/wordml" xmlns:wps="http://schemas.microsoft.com/office/word/2010/wordprocessingShape" mc:Ignorable="w14 w15 w16se w16cid w16 w16cex w16sdtdh w16du wp14">
   <w:footnote w:type="separator" w:id="-1">
     <w:p>
       <w:pPr>
@@ -12163,7 +12618,7 @@
 </file>
 
 <file path=word/numbering.xml><?xml version="1.0" encoding="utf-8"?>
-<w:numbering xmlns:wpc="http://schemas.microsoft.com/office/word/2010/wordprocessingCanvas" xmlns:cx="http://schemas.microsoft.com/office/drawing/2014/chartex" xmlns:cx1="http://schemas.microsoft.com/office/drawing/2015/9/8/chartex" xmlns:cx2="http://schemas.microsoft.com/office/drawing/2015/10/21/chartex" xmlns:cx3="http://schemas.microsoft.com/office/drawing/2016/5/9/chartex" xmlns:cx4="http://schemas.microsoft.com/office/drawing/2016/5/10/chartex" xmlns:cx5="http://schemas.microsoft.com/office/drawing/2016/5/11/chartex" xmlns:cx6="http://schemas.microsoft.com/office/drawing/2016/5/12/chartex" xmlns:cx7="http://schemas.microsoft.com/office/drawing/2016/5/13/chartex" xmlns:cx8="http://schemas.microsoft.com/office/drawing/2016/5/14/chartex" xmlns:mc="http://schemas.openxmlformats.org/markup-compatibility/2006" xmlns:aink="http://schemas.microsoft.com/office/drawing/2016/ink" xmlns:am3d="http://schemas.microsoft.com/office/drawing/2017/model3d" xmlns:o="urn:schemas-microsoft-com:office:office" xmlns:oel="http://schemas.microsoft.com/office/2019/extlst" xmlns:r="http://schemas.openxmlformats.org/officeDocument/2006/relationships" xmlns:m="http://schemas.openxmlformats.org/officeDocument/2006/math" xmlns:v="urn:schemas-microsoft-com:vml" xmlns:wp14="http://schemas.microsoft.com/office/word/2010/wordprocessingDrawing" xmlns:wp="http://schemas.openxmlformats.org/drawingml/2006/wordprocessingDrawing" xmlns:w10="urn:schemas-microsoft-com:office:word" xmlns:w="http://schemas.openxmlformats.org/wordprocessingml/2006/main" xmlns:w14="http://schemas.microsoft.com/office/word/2010/wordml" xmlns:w15="http://schemas.microsoft.com/office/word/2012/wordml" xmlns:w16cex="http://schemas.microsoft.com/office/word/2018/wordml/cex" xmlns:w16cid="http://schemas.microsoft.com/office/word/2016/wordml/cid" xmlns:w16="http://schemas.microsoft.com/office/word/2018/wordml" xmlns:w16sdtdh="http://schemas.microsoft.com/office/word/2020/wordml/sdtdatahash" xmlns:w16se="http://schemas.microsoft.com/office/word/2015/wordml/symex" xmlns:wpg="http://schemas.microsoft.com/office/word/2010/wordprocessingGroup" xmlns:wpi="http://schemas.microsoft.com/office/word/2010/wordprocessingInk" xmlns:wne="http://schemas.microsoft.com/office/word/2006/wordml" xmlns:wps="http://schemas.microsoft.com/office/word/2010/wordprocessingShape" mc:Ignorable="w14 w15 w16se w16cid w16 w16cex w16sdtdh wp14">
+<w:numbering xmlns:wpc="http://schemas.microsoft.com/office/word/2010/wordprocessingCanvas" xmlns:cx="http://schemas.microsoft.com/office/drawing/2014/chartex" xmlns:cx1="http://schemas.microsoft.com/office/drawing/2015/9/8/chartex" xmlns:cx2="http://schemas.microsoft.com/office/drawing/2015/10/21/chartex" xmlns:cx3="http://schemas.microsoft.com/office/drawing/2016/5/9/chartex" xmlns:cx4="http://schemas.microsoft.com/office/drawing/2016/5/10/chartex" xmlns:cx5="http://schemas.microsoft.com/office/drawing/2016/5/11/chartex" xmlns:cx6="http://schemas.microsoft.com/office/drawing/2016/5/12/chartex" xmlns:cx7="http://schemas.microsoft.com/office/drawing/2016/5/13/chartex" xmlns:cx8="http://schemas.microsoft.com/office/drawing/2016/5/14/chartex" xmlns:mc="http://schemas.openxmlformats.org/markup-compatibility/2006" xmlns:aink="http://schemas.microsoft.com/office/drawing/2016/ink" xmlns:am3d="http://schemas.microsoft.com/office/drawing/2017/model3d" xmlns:o="urn:schemas-microsoft-com:office:office" xmlns:oel="http://schemas.microsoft.com/office/2019/extlst" xmlns:r="http://schemas.openxmlformats.org/officeDocument/2006/relationships" xmlns:m="http://schemas.openxmlformats.org/officeDocument/2006/math" xmlns:v="urn:schemas-microsoft-com:vml" xmlns:wp14="http://schemas.microsoft.com/office/word/2010/wordprocessingDrawing" xmlns:wp="http://schemas.openxmlformats.org/drawingml/2006/wordprocessingDrawing" xmlns:w10="urn:schemas-microsoft-com:office:word" xmlns:w="http://schemas.openxmlformats.org/wordprocessingml/2006/main" xmlns:w14="http://schemas.microsoft.com/office/word/2010/wordml" xmlns:w15="http://schemas.microsoft.com/office/word/2012/wordml" xmlns:w16cex="http://schemas.microsoft.com/office/word/2018/wordml/cex" xmlns:w16cid="http://schemas.microsoft.com/office/word/2016/wordml/cid" xmlns:w16="http://schemas.microsoft.com/office/word/2018/wordml" xmlns:w16du="http://schemas.microsoft.com/office/word/2023/wordml/word16du" xmlns:w16sdtdh="http://schemas.microsoft.com/office/word/2020/wordml/sdtdatahash" xmlns:w16se="http://schemas.microsoft.com/office/word/2015/wordml/symex" xmlns:wpg="http://schemas.microsoft.com/office/word/2010/wordprocessingGroup" xmlns:wpi="http://schemas.microsoft.com/office/word/2010/wordprocessingInk" xmlns:wne="http://schemas.microsoft.com/office/word/2006/wordml" xmlns:wps="http://schemas.microsoft.com/office/word/2010/wordprocessingShape" mc:Ignorable="w14 w15 w16se w16cid w16 w16cex w16sdtdh w16du wp14">
   <w:abstractNum w:abstractNumId="0" w15:restartNumberingAfterBreak="0">
     <w:nsid w:val="3C51261C"/>
     <w:multiLevelType w:val="hybridMultilevel"/>
@@ -12492,7 +12947,7 @@
 </file>
 
 <file path=word/styles.xml><?xml version="1.0" encoding="utf-8"?>
-<w:styles xmlns:mc="http://schemas.openxmlformats.org/markup-compatibility/2006" xmlns:r="http://schemas.openxmlformats.org/officeDocument/2006/relationships" xmlns:w="http://schemas.openxmlformats.org/wordprocessingml/2006/main" xmlns:w14="http://schemas.microsoft.com/office/word/2010/wordml" xmlns:w15="http://schemas.microsoft.com/office/word/2012/wordml" xmlns:w16cex="http://schemas.microsoft.com/office/word/2018/wordml/cex" xmlns:w16cid="http://schemas.microsoft.com/office/word/2016/wordml/cid" xmlns:w16="http://schemas.microsoft.com/office/word/2018/wordml" xmlns:w16sdtdh="http://schemas.microsoft.com/office/word/2020/wordml/sdtdatahash" xmlns:w16se="http://schemas.microsoft.com/office/word/2015/wordml/symex" mc:Ignorable="w14 w15 w16se w16cid w16 w16cex w16sdtdh">
+<w:styles xmlns:mc="http://schemas.openxmlformats.org/markup-compatibility/2006" xmlns:r="http://schemas.openxmlformats.org/officeDocument/2006/relationships" xmlns:w="http://schemas.openxmlformats.org/wordprocessingml/2006/main" xmlns:w14="http://schemas.microsoft.com/office/word/2010/wordml" xmlns:w15="http://schemas.microsoft.com/office/word/2012/wordml" xmlns:w16cex="http://schemas.microsoft.com/office/word/2018/wordml/cex" xmlns:w16cid="http://schemas.microsoft.com/office/word/2016/wordml/cid" xmlns:w16="http://schemas.microsoft.com/office/word/2018/wordml" xmlns:w16du="http://schemas.microsoft.com/office/word/2023/wordml/word16du" xmlns:w16sdtdh="http://schemas.microsoft.com/office/word/2020/wordml/sdtdatahash" xmlns:w16se="http://schemas.microsoft.com/office/word/2015/wordml/symex" mc:Ignorable="w14 w15 w16se w16cid w16 w16cex w16sdtdh w16du">
   <w:docDefaults>
     <w:rPrDefault>
       <w:rPr>
@@ -12958,7 +13413,6 @@
   <w:style w:type="character" w:default="1" w:styleId="DefaultParagraphFont">
     <w:name w:val="Default Paragraph Font"/>
     <w:uiPriority w:val="1"/>
-    <w:semiHidden/>
     <w:unhideWhenUsed/>
   </w:style>
   <w:style w:type="table" w:default="1" w:styleId="TableNormal">

</xml_diff>